<commit_message>
Epic 1 - Pavlo Aizenberh
</commit_message>
<xml_diff>
--- a/ai_11/pavlo_aizenberh/epic_1/epic_1_report_pavlo_aizenberh.docx
+++ b/ai_11/pavlo_aizenberh/epic_1/epic_1_report_pavlo_aizenberh.docx
@@ -12,12 +12,12 @@
           <wp:inline distB="114300" distT="114300" distL="114300" distR="114300">
             <wp:extent cx="5731200" cy="4305300"/>
             <wp:effectExtent b="0" l="0" r="0" t="0"/>
-            <wp:docPr id="7" name="image7.png"/>
+            <wp:docPr id="6" name="image8.png"/>
             <a:graphic>
               <a:graphicData uri="http://schemas.openxmlformats.org/drawingml/2006/picture">
                 <pic:pic>
                   <pic:nvPicPr>
-                    <pic:cNvPr id="0" name="image7.png"/>
+                    <pic:cNvPr id="0" name="image8.png"/>
                     <pic:cNvPicPr preferRelativeResize="0"/>
                   </pic:nvPicPr>
                   <pic:blipFill>
@@ -655,7 +655,7 @@
       <w:pPr>
         <w:numPr>
           <w:ilvl w:val="0"/>
-          <w:numId w:val="11"/>
+          <w:numId w:val="10"/>
         </w:numPr>
         <w:spacing w:line="276" w:lineRule="auto"/>
         <w:ind w:left="720" w:hanging="360"/>
@@ -904,7 +904,7 @@
       <w:pPr>
         <w:numPr>
           <w:ilvl w:val="0"/>
-          <w:numId w:val="11"/>
+          <w:numId w:val="10"/>
         </w:numPr>
         <w:spacing w:line="276" w:lineRule="auto"/>
         <w:ind w:left="720" w:hanging="360"/>
@@ -1400,15 +1400,6 @@
         </w:rPr>
         <w:t xml:space="preserve">08.09.2026</w:t>
       </w:r>
-      <w:r>
-        <w:rPr>
-          <w:rFonts w:ascii="Times New Roman" w:cs="Times New Roman" w:eastAsia="Times New Roman" w:hAnsi="Times New Roman"/>
-          <w:sz w:val="24"/>
-          <w:szCs w:val="24"/>
-          <w:rtl w:val="0"/>
-        </w:rPr>
-        <w:t xml:space="preserve"> (DD/MM/YY)</w:t>
-      </w:r>
     </w:p>
     <w:p>
       <w:pPr>
@@ -1431,7 +1422,7 @@
           <w:szCs w:val="24"/>
           <w:rtl w:val="0"/>
         </w:rPr>
-        <w:t xml:space="preserve">Завершення опрацювання теми: 16.09.2026 (DD/MM/YY)</w:t>
+        <w:t xml:space="preserve">Завершення опрацювання теми: 16.09.2026 </w:t>
       </w:r>
     </w:p>
     <w:p>
@@ -1692,7 +1683,7 @@
           <w:szCs w:val="24"/>
           <w:rtl w:val="0"/>
         </w:rPr>
-        <w:t xml:space="preserve">Початок опрацювання теми: 08.09.2026 (DD/MM/YY)</w:t>
+        <w:t xml:space="preserve">Початок опрацювання теми: 08.09.2026 </w:t>
       </w:r>
     </w:p>
     <w:p>
@@ -1716,24 +1707,8 @@
           <w:szCs w:val="24"/>
           <w:rtl w:val="0"/>
         </w:rPr>
-        <w:t xml:space="preserve">Завершення опрацювання теми: 16.09.2026 (DD/MM/YY)</w:t>
-      </w:r>
-      <w:r>
-        <w:rPr>
-          <w:rtl w:val="0"/>
-        </w:rPr>
-      </w:r>
-    </w:p>
-    <w:p>
-      <w:pPr>
-        <w:spacing w:line="240" w:lineRule="auto"/>
-        <w:ind w:left="720" w:firstLine="0"/>
-        <w:rPr>
-          <w:rFonts w:ascii="Times New Roman" w:cs="Times New Roman" w:eastAsia="Times New Roman" w:hAnsi="Times New Roman"/>
-          <w:sz w:val="24"/>
-          <w:szCs w:val="24"/>
-        </w:rPr>
-      </w:pPr>
+        <w:t xml:space="preserve">Завершення опрацювання теми: 16.09.2026</w:t>
+      </w:r>
       <w:r>
         <w:rPr>
           <w:rtl w:val="0"/>
@@ -1830,7 +1805,7 @@
       <w:pPr>
         <w:numPr>
           <w:ilvl w:val="1"/>
-          <w:numId w:val="12"/>
+          <w:numId w:val="11"/>
         </w:numPr>
         <w:spacing w:line="240" w:lineRule="auto"/>
         <w:ind w:left="1440" w:hanging="360"/>
@@ -1854,7 +1829,7 @@
       <w:pPr>
         <w:numPr>
           <w:ilvl w:val="2"/>
-          <w:numId w:val="12"/>
+          <w:numId w:val="11"/>
         </w:numPr>
         <w:spacing w:line="240" w:lineRule="auto"/>
         <w:ind w:left="2160" w:hanging="360"/>
@@ -1878,7 +1853,7 @@
       <w:pPr>
         <w:numPr>
           <w:ilvl w:val="2"/>
-          <w:numId w:val="12"/>
+          <w:numId w:val="11"/>
         </w:numPr>
         <w:spacing w:line="240" w:lineRule="auto"/>
         <w:ind w:left="2160" w:hanging="360"/>
@@ -1932,7 +1907,7 @@
       <w:pPr>
         <w:numPr>
           <w:ilvl w:val="1"/>
-          <w:numId w:val="12"/>
+          <w:numId w:val="11"/>
         </w:numPr>
         <w:spacing w:line="240" w:lineRule="auto"/>
         <w:ind w:left="1440" w:hanging="360"/>
@@ -1956,7 +1931,7 @@
       <w:pPr>
         <w:numPr>
           <w:ilvl w:val="2"/>
-          <w:numId w:val="12"/>
+          <w:numId w:val="11"/>
         </w:numPr>
         <w:spacing w:line="240" w:lineRule="auto"/>
         <w:ind w:left="2160" w:hanging="360"/>
@@ -1980,7 +1955,7 @@
       <w:pPr>
         <w:numPr>
           <w:ilvl w:val="2"/>
-          <w:numId w:val="12"/>
+          <w:numId w:val="11"/>
         </w:numPr>
         <w:spacing w:line="240" w:lineRule="auto"/>
         <w:ind w:left="2160" w:hanging="360"/>
@@ -2021,7 +1996,7 @@
       <w:pPr>
         <w:numPr>
           <w:ilvl w:val="1"/>
-          <w:numId w:val="12"/>
+          <w:numId w:val="11"/>
         </w:numPr>
         <w:spacing w:line="240" w:lineRule="auto"/>
         <w:ind w:left="1440" w:hanging="360"/>
@@ -2054,7 +2029,7 @@
       <w:pPr>
         <w:numPr>
           <w:ilvl w:val="1"/>
-          <w:numId w:val="12"/>
+          <w:numId w:val="11"/>
         </w:numPr>
         <w:spacing w:line="240" w:lineRule="auto"/>
         <w:ind w:left="1440" w:hanging="360"/>
@@ -2096,7 +2071,7 @@
       <w:pPr>
         <w:numPr>
           <w:ilvl w:val="1"/>
-          <w:numId w:val="12"/>
+          <w:numId w:val="11"/>
         </w:numPr>
         <w:spacing w:line="240" w:lineRule="auto"/>
         <w:ind w:left="1440" w:hanging="360"/>
@@ -2193,7 +2168,7 @@
       <w:pPr>
         <w:numPr>
           <w:ilvl w:val="1"/>
-          <w:numId w:val="12"/>
+          <w:numId w:val="11"/>
         </w:numPr>
         <w:spacing w:line="240" w:lineRule="auto"/>
         <w:ind w:left="1440" w:hanging="360"/>
@@ -2217,7 +2192,7 @@
       <w:pPr>
         <w:numPr>
           <w:ilvl w:val="2"/>
-          <w:numId w:val="12"/>
+          <w:numId w:val="11"/>
         </w:numPr>
         <w:spacing w:line="240" w:lineRule="auto"/>
         <w:ind w:left="2160" w:hanging="360"/>
@@ -2266,7 +2241,7 @@
       <w:pPr>
         <w:numPr>
           <w:ilvl w:val="1"/>
-          <w:numId w:val="12"/>
+          <w:numId w:val="11"/>
         </w:numPr>
         <w:spacing w:line="240" w:lineRule="auto"/>
         <w:ind w:left="1440" w:hanging="360"/>
@@ -2290,7 +2265,7 @@
       <w:pPr>
         <w:numPr>
           <w:ilvl w:val="2"/>
-          <w:numId w:val="12"/>
+          <w:numId w:val="11"/>
         </w:numPr>
         <w:spacing w:line="240" w:lineRule="auto"/>
         <w:ind w:left="2160" w:hanging="360"/>
@@ -2319,7 +2294,7 @@
       <w:pPr>
         <w:numPr>
           <w:ilvl w:val="2"/>
-          <w:numId w:val="12"/>
+          <w:numId w:val="11"/>
         </w:numPr>
         <w:spacing w:line="240" w:lineRule="auto"/>
         <w:ind w:left="2160" w:hanging="360"/>
@@ -2365,7 +2340,7 @@
       <w:pPr>
         <w:numPr>
           <w:ilvl w:val="1"/>
-          <w:numId w:val="12"/>
+          <w:numId w:val="11"/>
         </w:numPr>
         <w:spacing w:line="240" w:lineRule="auto"/>
         <w:ind w:left="1440" w:hanging="360"/>
@@ -2389,7 +2364,7 @@
       <w:pPr>
         <w:numPr>
           <w:ilvl w:val="1"/>
-          <w:numId w:val="12"/>
+          <w:numId w:val="11"/>
         </w:numPr>
         <w:spacing w:line="240" w:lineRule="auto"/>
         <w:ind w:left="1440" w:hanging="360"/>
@@ -2413,7 +2388,7 @@
       <w:pPr>
         <w:numPr>
           <w:ilvl w:val="1"/>
-          <w:numId w:val="12"/>
+          <w:numId w:val="11"/>
         </w:numPr>
         <w:spacing w:line="240" w:lineRule="auto"/>
         <w:ind w:left="1440" w:hanging="360"/>
@@ -2660,7 +2635,20 @@
             <w:u w:val="single"/>
             <w:rtl w:val="0"/>
           </w:rPr>
-          <w:t xml:space="preserve">Cтаття на Reddit</w:t>
+          <w:t xml:space="preserve">Cтаття</w:t>
+        </w:r>
+      </w:hyperlink>
+      <w:hyperlink r:id="rId16">
+        <w:r>
+          <w:rPr>
+            <w:rFonts w:ascii="Times New Roman" w:cs="Times New Roman" w:eastAsia="Times New Roman" w:hAnsi="Times New Roman"/>
+            <w:color w:val="1155cc"/>
+            <w:sz w:val="24"/>
+            <w:szCs w:val="24"/>
+            <w:u w:val="single"/>
+            <w:rtl w:val="0"/>
+          </w:rPr>
+          <w:t xml:space="preserve"> на Reddit</w:t>
         </w:r>
       </w:hyperlink>
       <w:r>
@@ -3229,7 +3217,7 @@
       <w:pPr>
         <w:numPr>
           <w:ilvl w:val="0"/>
-          <w:numId w:val="10"/>
+          <w:numId w:val="9"/>
         </w:numPr>
         <w:spacing w:line="240" w:lineRule="auto"/>
         <w:ind w:left="720" w:hanging="360"/>
@@ -3253,7 +3241,7 @@
       <w:pPr>
         <w:numPr>
           <w:ilvl w:val="1"/>
-          <w:numId w:val="10"/>
+          <w:numId w:val="9"/>
         </w:numPr>
         <w:spacing w:line="240" w:lineRule="auto"/>
         <w:ind w:left="1440" w:hanging="360"/>
@@ -3277,7 +3265,7 @@
       <w:pPr>
         <w:numPr>
           <w:ilvl w:val="2"/>
-          <w:numId w:val="10"/>
+          <w:numId w:val="9"/>
         </w:numPr>
         <w:spacing w:line="240" w:lineRule="auto"/>
         <w:ind w:left="2160" w:hanging="360"/>
@@ -3306,7 +3294,7 @@
       <w:pPr>
         <w:numPr>
           <w:ilvl w:val="2"/>
-          <w:numId w:val="10"/>
+          <w:numId w:val="9"/>
         </w:numPr>
         <w:spacing w:line="240" w:lineRule="auto"/>
         <w:ind w:left="2160" w:hanging="360"/>
@@ -3316,7 +3304,7 @@
           <w:szCs w:val="24"/>
         </w:rPr>
       </w:pPr>
-      <w:hyperlink r:id="rId16">
+      <w:hyperlink r:id="rId17">
         <w:r>
           <w:rPr>
             <w:rFonts w:ascii="Times New Roman" w:cs="Times New Roman" w:eastAsia="Times New Roman" w:hAnsi="Times New Roman"/>
@@ -3355,7 +3343,7 @@
       <w:pPr>
         <w:numPr>
           <w:ilvl w:val="1"/>
-          <w:numId w:val="10"/>
+          <w:numId w:val="9"/>
         </w:numPr>
         <w:spacing w:line="240" w:lineRule="auto"/>
         <w:ind w:left="1440" w:hanging="360"/>
@@ -3379,7 +3367,7 @@
       <w:pPr>
         <w:numPr>
           <w:ilvl w:val="2"/>
-          <w:numId w:val="10"/>
+          <w:numId w:val="9"/>
         </w:numPr>
         <w:spacing w:line="240" w:lineRule="auto"/>
         <w:ind w:left="2160" w:hanging="360"/>
@@ -3403,7 +3391,7 @@
       <w:pPr>
         <w:numPr>
           <w:ilvl w:val="2"/>
-          <w:numId w:val="10"/>
+          <w:numId w:val="9"/>
         </w:numPr>
         <w:spacing w:line="240" w:lineRule="auto"/>
         <w:ind w:left="2160" w:hanging="360"/>
@@ -3428,7 +3416,7 @@
       <w:pPr>
         <w:numPr>
           <w:ilvl w:val="2"/>
-          <w:numId w:val="10"/>
+          <w:numId w:val="9"/>
         </w:numPr>
         <w:spacing w:line="240" w:lineRule="auto"/>
         <w:ind w:left="2160" w:hanging="360"/>
@@ -3471,7 +3459,7 @@
       <w:pPr>
         <w:numPr>
           <w:ilvl w:val="2"/>
-          <w:numId w:val="10"/>
+          <w:numId w:val="9"/>
         </w:numPr>
         <w:spacing w:line="240" w:lineRule="auto"/>
         <w:ind w:left="2160" w:hanging="360"/>
@@ -3512,7 +3500,7 @@
       <w:pPr>
         <w:numPr>
           <w:ilvl w:val="1"/>
-          <w:numId w:val="10"/>
+          <w:numId w:val="9"/>
         </w:numPr>
         <w:spacing w:line="240" w:lineRule="auto"/>
         <w:ind w:left="1440" w:hanging="360"/>
@@ -3536,7 +3524,7 @@
       <w:pPr>
         <w:numPr>
           <w:ilvl w:val="1"/>
-          <w:numId w:val="10"/>
+          <w:numId w:val="9"/>
         </w:numPr>
         <w:spacing w:line="240" w:lineRule="auto"/>
         <w:ind w:left="1440" w:hanging="360"/>
@@ -3560,7 +3548,7 @@
       <w:pPr>
         <w:numPr>
           <w:ilvl w:val="1"/>
-          <w:numId w:val="10"/>
+          <w:numId w:val="9"/>
         </w:numPr>
         <w:spacing w:line="240" w:lineRule="auto"/>
         <w:ind w:left="1440" w:hanging="360"/>
@@ -3740,7 +3728,7 @@
       <w:pPr>
         <w:numPr>
           <w:ilvl w:val="0"/>
-          <w:numId w:val="13"/>
+          <w:numId w:val="12"/>
         </w:numPr>
         <w:spacing w:line="259" w:lineRule="auto"/>
         <w:ind w:left="720" w:hanging="360"/>
@@ -4122,7 +4110,25 @@
           <w:szCs w:val="24"/>
           <w:rtl w:val="0"/>
         </w:rPr>
-        <w:t xml:space="preserve">Встановити розширення для C/C++, IntelliSense та Code Runner у Visual Studio Code для зручної розробки та запуску коду. </w:t>
+        <w:t xml:space="preserve">Встановити розширення для C/C++, IntelliSense та </w:t>
+      </w:r>
+      <w:r>
+        <w:rPr>
+          <w:rFonts w:ascii="Times New Roman" w:cs="Times New Roman" w:eastAsia="Times New Roman" w:hAnsi="Times New Roman"/>
+          <w:sz w:val="24"/>
+          <w:szCs w:val="24"/>
+          <w:rtl w:val="0"/>
+        </w:rPr>
+        <w:t xml:space="preserve">Code Runner</w:t>
+      </w:r>
+      <w:r>
+        <w:rPr>
+          <w:rFonts w:ascii="Times New Roman" w:cs="Times New Roman" w:eastAsia="Times New Roman" w:hAnsi="Times New Roman"/>
+          <w:sz w:val="24"/>
+          <w:szCs w:val="24"/>
+          <w:rtl w:val="0"/>
+        </w:rPr>
+        <w:t xml:space="preserve"> у Visual Studio Code для зручної розробки та запуску коду. </w:t>
       </w:r>
       <w:r>
         <w:rPr>
@@ -4701,6 +4707,71 @@
     <w:p>
       <w:pPr>
         <w:spacing w:line="240" w:lineRule="auto"/>
+        <w:jc w:val="both"/>
+        <w:rPr>
+          <w:rFonts w:ascii="Times New Roman" w:cs="Times New Roman" w:eastAsia="Times New Roman" w:hAnsi="Times New Roman"/>
+          <w:sz w:val="24"/>
+          <w:szCs w:val="24"/>
+        </w:rPr>
+      </w:pPr>
+      <w:r>
+        <w:rPr>
+          <w:rtl w:val="0"/>
+        </w:rPr>
+      </w:r>
+    </w:p>
+    <w:p>
+      <w:pPr>
+        <w:spacing w:line="276" w:lineRule="auto"/>
+        <w:jc w:val="both"/>
+        <w:rPr>
+          <w:rFonts w:ascii="Times New Roman" w:cs="Times New Roman" w:eastAsia="Times New Roman" w:hAnsi="Times New Roman"/>
+          <w:b w:val="1"/>
+          <w:bCs w:val="1"/>
+          <w:sz w:val="24"/>
+          <w:szCs w:val="24"/>
+        </w:rPr>
+      </w:pPr>
+      <w:r>
+        <w:rPr>
+          <w:rFonts w:ascii="Times New Roman" w:cs="Times New Roman" w:eastAsia="Times New Roman" w:hAnsi="Times New Roman"/>
+          <w:b w:val="1"/>
+          <w:bCs w:val="1"/>
+          <w:sz w:val="24"/>
+          <w:szCs w:val="24"/>
+          <w:rtl w:val="0"/>
+        </w:rPr>
+        <w:t xml:space="preserve">Завдання №14 Algotester task 0001</w:t>
+      </w:r>
+    </w:p>
+    <w:p>
+      <w:pPr>
+        <w:numPr>
+          <w:ilvl w:val="0"/>
+          <w:numId w:val="4"/>
+        </w:numPr>
+        <w:spacing w:line="240" w:lineRule="auto"/>
+        <w:ind w:left="720" w:hanging="360"/>
+        <w:jc w:val="both"/>
+        <w:rPr>
+          <w:rFonts w:ascii="Times New Roman" w:cs="Times New Roman" w:eastAsia="Times New Roman" w:hAnsi="Times New Roman"/>
+          <w:sz w:val="24"/>
+          <w:szCs w:val="24"/>
+        </w:rPr>
+      </w:pPr>
+      <w:r>
+        <w:rPr>
+          <w:rFonts w:ascii="Times New Roman" w:cs="Times New Roman" w:eastAsia="Times New Roman" w:hAnsi="Times New Roman"/>
+          <w:sz w:val="24"/>
+          <w:szCs w:val="24"/>
+          <w:rtl w:val="0"/>
+        </w:rPr>
+        <w:t xml:space="preserve">Виконати завдання №1 з Algotester</w:t>
+      </w:r>
+    </w:p>
+    <w:p>
+      <w:pPr>
+        <w:spacing w:line="240" w:lineRule="auto"/>
         <w:ind w:left="720" w:firstLine="0"/>
         <w:jc w:val="both"/>
         <w:rPr>
@@ -4717,6 +4788,55 @@
     </w:p>
     <w:p>
       <w:pPr>
+        <w:spacing w:line="276" w:lineRule="auto"/>
+        <w:jc w:val="both"/>
+        <w:rPr>
+          <w:rFonts w:ascii="Times New Roman" w:cs="Times New Roman" w:eastAsia="Times New Roman" w:hAnsi="Times New Roman"/>
+          <w:b w:val="1"/>
+          <w:bCs w:val="1"/>
+          <w:sz w:val="24"/>
+          <w:szCs w:val="24"/>
+        </w:rPr>
+      </w:pPr>
+      <w:r>
+        <w:rPr>
+          <w:rFonts w:ascii="Times New Roman" w:cs="Times New Roman" w:eastAsia="Times New Roman" w:hAnsi="Times New Roman"/>
+          <w:b w:val="1"/>
+          <w:bCs w:val="1"/>
+          <w:sz w:val="24"/>
+          <w:szCs w:val="24"/>
+          <w:rtl w:val="0"/>
+        </w:rPr>
+        <w:t xml:space="preserve">Завдання №15 Algotester task 0011</w:t>
+      </w:r>
+    </w:p>
+    <w:p>
+      <w:pPr>
+        <w:numPr>
+          <w:ilvl w:val="0"/>
+          <w:numId w:val="4"/>
+        </w:numPr>
+        <w:spacing w:line="240" w:lineRule="auto"/>
+        <w:ind w:left="720" w:hanging="360"/>
+        <w:jc w:val="both"/>
+        <w:rPr>
+          <w:rFonts w:ascii="Times New Roman" w:cs="Times New Roman" w:eastAsia="Times New Roman" w:hAnsi="Times New Roman"/>
+          <w:sz w:val="24"/>
+          <w:szCs w:val="24"/>
+        </w:rPr>
+      </w:pPr>
+      <w:r>
+        <w:rPr>
+          <w:rFonts w:ascii="Times New Roman" w:cs="Times New Roman" w:eastAsia="Times New Roman" w:hAnsi="Times New Roman"/>
+          <w:sz w:val="24"/>
+          <w:szCs w:val="24"/>
+          <w:rtl w:val="0"/>
+        </w:rPr>
+        <w:t xml:space="preserve">Виконати завдання №0011 з Algotester</w:t>
+      </w:r>
+    </w:p>
+    <w:p>
+      <w:pPr>
         <w:spacing w:line="240" w:lineRule="auto"/>
         <w:ind w:left="720" w:firstLine="0"/>
         <w:jc w:val="both"/>
@@ -4730,6 +4850,121 @@
         <w:rPr>
           <w:rtl w:val="0"/>
         </w:rPr>
+      </w:r>
+    </w:p>
+    <w:p>
+      <w:pPr>
+        <w:spacing w:line="276" w:lineRule="auto"/>
+        <w:jc w:val="both"/>
+        <w:rPr>
+          <w:rFonts w:ascii="Times New Roman" w:cs="Times New Roman" w:eastAsia="Times New Roman" w:hAnsi="Times New Roman"/>
+          <w:b w:val="1"/>
+          <w:bCs w:val="1"/>
+          <w:sz w:val="24"/>
+          <w:szCs w:val="24"/>
+        </w:rPr>
+      </w:pPr>
+      <w:r>
+        <w:rPr>
+          <w:rFonts w:ascii="Times New Roman" w:cs="Times New Roman" w:eastAsia="Times New Roman" w:hAnsi="Times New Roman"/>
+          <w:b w:val="1"/>
+          <w:bCs w:val="1"/>
+          <w:sz w:val="24"/>
+          <w:szCs w:val="24"/>
+          <w:rtl w:val="0"/>
+        </w:rPr>
+        <w:t xml:space="preserve">Завдання №16 Algotester task 0021</w:t>
+      </w:r>
+    </w:p>
+    <w:p>
+      <w:pPr>
+        <w:numPr>
+          <w:ilvl w:val="0"/>
+          <w:numId w:val="4"/>
+        </w:numPr>
+        <w:spacing w:line="240" w:lineRule="auto"/>
+        <w:ind w:left="720" w:hanging="360"/>
+        <w:jc w:val="both"/>
+        <w:rPr>
+          <w:rFonts w:ascii="Times New Roman" w:cs="Times New Roman" w:eastAsia="Times New Roman" w:hAnsi="Times New Roman"/>
+          <w:sz w:val="24"/>
+          <w:szCs w:val="24"/>
+        </w:rPr>
+      </w:pPr>
+      <w:r>
+        <w:rPr>
+          <w:rFonts w:ascii="Times New Roman" w:cs="Times New Roman" w:eastAsia="Times New Roman" w:hAnsi="Times New Roman"/>
+          <w:sz w:val="24"/>
+          <w:szCs w:val="24"/>
+          <w:rtl w:val="0"/>
+        </w:rPr>
+        <w:t xml:space="preserve">Виконати завдання №0021 з Algotester</w:t>
+      </w:r>
+    </w:p>
+    <w:p>
+      <w:pPr>
+        <w:spacing w:line="240" w:lineRule="auto"/>
+        <w:ind w:left="720" w:firstLine="0"/>
+        <w:jc w:val="both"/>
+        <w:rPr>
+          <w:rFonts w:ascii="Times New Roman" w:cs="Times New Roman" w:eastAsia="Times New Roman" w:hAnsi="Times New Roman"/>
+          <w:sz w:val="24"/>
+          <w:szCs w:val="24"/>
+        </w:rPr>
+      </w:pPr>
+      <w:r>
+        <w:rPr>
+          <w:rtl w:val="0"/>
+        </w:rPr>
+      </w:r>
+    </w:p>
+    <w:p>
+      <w:pPr>
+        <w:spacing w:line="276" w:lineRule="auto"/>
+        <w:jc w:val="both"/>
+        <w:rPr>
+          <w:rFonts w:ascii="Times New Roman" w:cs="Times New Roman" w:eastAsia="Times New Roman" w:hAnsi="Times New Roman"/>
+          <w:b w:val="1"/>
+          <w:bCs w:val="1"/>
+          <w:sz w:val="24"/>
+          <w:szCs w:val="24"/>
+        </w:rPr>
+      </w:pPr>
+      <w:r>
+        <w:rPr>
+          <w:rFonts w:ascii="Times New Roman" w:cs="Times New Roman" w:eastAsia="Times New Roman" w:hAnsi="Times New Roman"/>
+          <w:b w:val="1"/>
+          <w:bCs w:val="1"/>
+          <w:sz w:val="24"/>
+          <w:szCs w:val="24"/>
+          <w:rtl w:val="0"/>
+        </w:rPr>
+        <w:t xml:space="preserve">Завдання №17 Algotester task 0181</w:t>
+      </w:r>
+    </w:p>
+    <w:p>
+      <w:pPr>
+        <w:numPr>
+          <w:ilvl w:val="0"/>
+          <w:numId w:val="4"/>
+        </w:numPr>
+        <w:spacing w:line="240" w:lineRule="auto"/>
+        <w:ind w:left="720" w:hanging="360"/>
+        <w:jc w:val="both"/>
+        <w:rPr>
+          <w:rFonts w:ascii="Times New Roman" w:cs="Times New Roman" w:eastAsia="Times New Roman" w:hAnsi="Times New Roman"/>
+          <w:sz w:val="24"/>
+          <w:szCs w:val="24"/>
+        </w:rPr>
+      </w:pPr>
+      <w:r>
+        <w:rPr>
+          <w:rFonts w:ascii="Times New Roman" w:cs="Times New Roman" w:eastAsia="Times New Roman" w:hAnsi="Times New Roman"/>
+          <w:sz w:val="24"/>
+          <w:szCs w:val="24"/>
+          <w:rtl w:val="0"/>
+        </w:rPr>
+        <w:t xml:space="preserve">Виконати завдання №0181 з Algotester</w:t>
       </w:r>
     </w:p>
     <w:p>
@@ -4839,7 +5074,7 @@
       <w:pPr>
         <w:numPr>
           <w:ilvl w:val="0"/>
-          <w:numId w:val="9"/>
+          <w:numId w:val="8"/>
         </w:numPr>
         <w:spacing w:line="240" w:lineRule="auto"/>
         <w:ind w:left="720" w:hanging="360"/>
@@ -4857,6 +5092,39 @@
           <w:rtl w:val="0"/>
         </w:rPr>
         <w:t xml:space="preserve">Блок-схема:</w:t>
+      </w:r>
+    </w:p>
+    <w:p>
+      <w:pPr>
+        <w:spacing w:line="240" w:lineRule="auto"/>
+        <w:ind w:left="720" w:firstLine="0"/>
+        <w:rPr>
+          <w:rFonts w:ascii="Times New Roman" w:cs="Times New Roman" w:eastAsia="Times New Roman" w:hAnsi="Times New Roman"/>
+          <w:sz w:val="24"/>
+          <w:szCs w:val="24"/>
+        </w:rPr>
+      </w:pPr>
+      <w:r>
+        <w:rPr>
+          <w:rtl w:val="0"/>
+        </w:rPr>
+      </w:r>
+    </w:p>
+    <w:p>
+      <w:pPr>
+        <w:spacing w:line="240" w:lineRule="auto"/>
+        <w:ind w:left="720" w:firstLine="0"/>
+        <w:rPr>
+          <w:rFonts w:ascii="Times New Roman" w:cs="Times New Roman" w:eastAsia="Times New Roman" w:hAnsi="Times New Roman"/>
+          <w:sz w:val="24"/>
+          <w:szCs w:val="24"/>
+          <w:shd w:fill="fff2cc" w:val="clear"/>
+        </w:rPr>
+      </w:pPr>
+      <w:r>
+        <w:rPr>
+          <w:rtl w:val="0"/>
+        </w:rPr>
       </w:r>
     </w:p>
     <w:p>
@@ -4877,86 +5145,14 @@
         </w:rPr>
         <w:drawing>
           <wp:inline distB="114300" distT="114300" distL="114300" distR="114300">
-            <wp:extent cx="4867275" cy="7172325"/>
+            <wp:extent cx="4000500" cy="6886575"/>
             <wp:effectExtent b="0" l="0" r="0" t="0"/>
-            <wp:docPr id="4" name="image10.png"/>
+            <wp:docPr id="17" name="image27.png"/>
             <a:graphic>
               <a:graphicData uri="http://schemas.openxmlformats.org/drawingml/2006/picture">
                 <pic:pic>
                   <pic:nvPicPr>
-                    <pic:cNvPr id="0" name="image10.png"/>
-                    <pic:cNvPicPr preferRelativeResize="0"/>
-                  </pic:nvPicPr>
-                  <pic:blipFill>
-                    <a:blip r:embed="rId17"/>
-                    <a:srcRect b="0" l="0" r="0" t="0"/>
-                    <a:stretch>
-                      <a:fillRect/>
-                    </a:stretch>
-                  </pic:blipFill>
-                  <pic:spPr>
-                    <a:xfrm>
-                      <a:off x="0" y="0"/>
-                      <a:ext cx="4867275" cy="7172325"/>
-                    </a:xfrm>
-                    <a:prstGeom prst="rect"/>
-                    <a:ln/>
-                  </pic:spPr>
-                </pic:pic>
-              </a:graphicData>
-            </a:graphic>
-          </wp:inline>
-        </w:drawing>
-      </w:r>
-      <w:r>
-        <w:rPr>
-          <w:rtl w:val="0"/>
-        </w:rPr>
-      </w:r>
-    </w:p>
-    <w:p>
-      <w:pPr>
-        <w:spacing w:line="240" w:lineRule="auto"/>
-        <w:ind w:left="720" w:firstLine="0"/>
-        <w:rPr>
-          <w:rFonts w:ascii="Times New Roman" w:cs="Times New Roman" w:eastAsia="Times New Roman" w:hAnsi="Times New Roman"/>
-          <w:sz w:val="24"/>
-          <w:szCs w:val="24"/>
-          <w:shd w:fill="fff2cc" w:val="clear"/>
-        </w:rPr>
-      </w:pPr>
-      <w:r>
-        <w:rPr>
-          <w:rtl w:val="0"/>
-        </w:rPr>
-      </w:r>
-    </w:p>
-    <w:p>
-      <w:pPr>
-        <w:spacing w:line="240" w:lineRule="auto"/>
-        <w:ind w:left="720" w:firstLine="0"/>
-        <w:rPr>
-          <w:rFonts w:ascii="Times New Roman" w:cs="Times New Roman" w:eastAsia="Times New Roman" w:hAnsi="Times New Roman"/>
-          <w:sz w:val="24"/>
-          <w:szCs w:val="24"/>
-        </w:rPr>
-      </w:pPr>
-      <w:r>
-        <w:rPr>
-          <w:rFonts w:ascii="Times New Roman" w:cs="Times New Roman" w:eastAsia="Times New Roman" w:hAnsi="Times New Roman"/>
-          <w:sz w:val="24"/>
-          <w:szCs w:val="24"/>
-        </w:rPr>
-        <w:drawing>
-          <wp:inline distB="114300" distT="114300" distL="114300" distR="114300">
-            <wp:extent cx="5181600" cy="7439025"/>
-            <wp:effectExtent b="0" l="0" r="0" t="0"/>
-            <wp:docPr id="15" name="image4.png"/>
-            <a:graphic>
-              <a:graphicData uri="http://schemas.openxmlformats.org/drawingml/2006/picture">
-                <pic:pic>
-                  <pic:nvPicPr>
-                    <pic:cNvPr id="0" name="image4.png"/>
+                    <pic:cNvPr id="0" name="image27.png"/>
                     <pic:cNvPicPr preferRelativeResize="0"/>
                   </pic:nvPicPr>
                   <pic:blipFill>
@@ -4969,7 +5165,7 @@
                   <pic:spPr>
                     <a:xfrm>
                       <a:off x="0" y="0"/>
-                      <a:ext cx="5181600" cy="7439025"/>
+                      <a:ext cx="4000500" cy="6886575"/>
                     </a:xfrm>
                     <a:prstGeom prst="rect"/>
                     <a:ln/>
@@ -4988,14 +5184,14 @@
         </w:rPr>
         <w:drawing>
           <wp:inline distB="114300" distT="114300" distL="114300" distR="114300">
-            <wp:extent cx="5731200" cy="5181600"/>
+            <wp:extent cx="4552950" cy="6381750"/>
             <wp:effectExtent b="0" l="0" r="0" t="0"/>
-            <wp:docPr id="22" name="image6.png"/>
+            <wp:docPr id="10" name="image16.png"/>
             <a:graphic>
               <a:graphicData uri="http://schemas.openxmlformats.org/drawingml/2006/picture">
                 <pic:pic>
                   <pic:nvPicPr>
-                    <pic:cNvPr id="0" name="image6.png"/>
+                    <pic:cNvPr id="0" name="image16.png"/>
                     <pic:cNvPicPr preferRelativeResize="0"/>
                   </pic:nvPicPr>
                   <pic:blipFill>
@@ -5008,7 +5204,7 @@
                   <pic:spPr>
                     <a:xfrm>
                       <a:off x="0" y="0"/>
-                      <a:ext cx="5731200" cy="5181600"/>
+                      <a:ext cx="4552950" cy="6381750"/>
                     </a:xfrm>
                     <a:prstGeom prst="rect"/>
                     <a:ln/>
@@ -5027,14 +5223,14 @@
         </w:rPr>
         <w:drawing>
           <wp:inline distB="114300" distT="114300" distL="114300" distR="114300">
-            <wp:extent cx="5731200" cy="5194300"/>
+            <wp:extent cx="5731200" cy="6007100"/>
             <wp:effectExtent b="0" l="0" r="0" t="0"/>
-            <wp:docPr id="18" name="image3.png"/>
+            <wp:docPr id="29" name="image26.png"/>
             <a:graphic>
               <a:graphicData uri="http://schemas.openxmlformats.org/drawingml/2006/picture">
                 <pic:pic>
                   <pic:nvPicPr>
-                    <pic:cNvPr id="0" name="image3.png"/>
+                    <pic:cNvPr id="0" name="image26.png"/>
                     <pic:cNvPicPr preferRelativeResize="0"/>
                   </pic:nvPicPr>
                   <pic:blipFill>
@@ -5047,7 +5243,7 @@
                   <pic:spPr>
                     <a:xfrm>
                       <a:off x="0" y="0"/>
-                      <a:ext cx="5731200" cy="5194300"/>
+                      <a:ext cx="5731200" cy="6007100"/>
                     </a:xfrm>
                     <a:prstGeom prst="rect"/>
                     <a:ln/>
@@ -5139,7 +5335,7 @@
       <w:pPr>
         <w:numPr>
           <w:ilvl w:val="0"/>
-          <w:numId w:val="8"/>
+          <w:numId w:val="7"/>
         </w:numPr>
         <w:spacing w:line="240" w:lineRule="auto"/>
         <w:ind w:left="720" w:hanging="360"/>
@@ -5173,7 +5369,7 @@
       <w:pPr>
         <w:numPr>
           <w:ilvl w:val="0"/>
-          <w:numId w:val="8"/>
+          <w:numId w:val="7"/>
         </w:numPr>
         <w:spacing w:line="240" w:lineRule="auto"/>
         <w:ind w:left="720" w:hanging="360"/>
@@ -5277,7 +5473,7 @@
       <w:pPr>
         <w:numPr>
           <w:ilvl w:val="0"/>
-          <w:numId w:val="8"/>
+          <w:numId w:val="7"/>
         </w:numPr>
         <w:spacing w:line="276" w:lineRule="auto"/>
         <w:ind w:left="720" w:hanging="360"/>
@@ -5312,7 +5508,7 @@
       <w:pPr>
         <w:numPr>
           <w:ilvl w:val="0"/>
-          <w:numId w:val="8"/>
+          <w:numId w:val="7"/>
         </w:numPr>
         <w:spacing w:line="276" w:lineRule="auto"/>
         <w:ind w:left="720" w:hanging="360"/>
@@ -5360,12 +5556,12 @@
           <wp:inline distB="114300" distT="114300" distL="114300" distR="114300">
             <wp:extent cx="5731200" cy="2844800"/>
             <wp:effectExtent b="0" l="0" r="0" t="0"/>
-            <wp:docPr id="3" name="image28.png"/>
+            <wp:docPr id="3" name="image24.png"/>
             <a:graphic>
               <a:graphicData uri="http://schemas.openxmlformats.org/drawingml/2006/picture">
                 <pic:pic>
                   <pic:nvPicPr>
-                    <pic:cNvPr id="0" name="image28.png"/>
+                    <pic:cNvPr id="0" name="image24.png"/>
                     <pic:cNvPicPr preferRelativeResize="0"/>
                   </pic:nvPicPr>
                   <pic:blipFill>
@@ -5399,7 +5595,7 @@
       <w:pPr>
         <w:numPr>
           <w:ilvl w:val="0"/>
-          <w:numId w:val="8"/>
+          <w:numId w:val="7"/>
         </w:numPr>
         <w:spacing w:line="240" w:lineRule="auto"/>
         <w:ind w:left="720" w:hanging="360"/>
@@ -5546,7 +5742,7 @@
       <w:pPr>
         <w:numPr>
           <w:ilvl w:val="0"/>
-          <w:numId w:val="8"/>
+          <w:numId w:val="7"/>
         </w:numPr>
         <w:spacing w:line="276" w:lineRule="auto"/>
         <w:ind w:left="720" w:hanging="360"/>
@@ -5571,7 +5767,7 @@
       <w:pPr>
         <w:numPr>
           <w:ilvl w:val="0"/>
-          <w:numId w:val="8"/>
+          <w:numId w:val="7"/>
         </w:numPr>
         <w:spacing w:line="276" w:lineRule="auto"/>
         <w:ind w:left="720" w:hanging="360"/>
@@ -5601,12 +5797,12 @@
           <wp:inline distB="114300" distT="114300" distL="114300" distR="114300">
             <wp:extent cx="5731200" cy="2997200"/>
             <wp:effectExtent b="0" l="0" r="0" t="0"/>
-            <wp:docPr id="9" name="image23.png"/>
+            <wp:docPr id="9" name="image12.png"/>
             <a:graphic>
               <a:graphicData uri="http://schemas.openxmlformats.org/drawingml/2006/picture">
                 <pic:pic>
                   <pic:nvPicPr>
-                    <pic:cNvPr id="0" name="image23.png"/>
+                    <pic:cNvPr id="0" name="image12.png"/>
                     <pic:cNvPicPr preferRelativeResize="0"/>
                   </pic:nvPicPr>
                   <pic:blipFill>
@@ -5793,7 +5989,7 @@
       <w:pPr>
         <w:numPr>
           <w:ilvl w:val="0"/>
-          <w:numId w:val="8"/>
+          <w:numId w:val="7"/>
         </w:numPr>
         <w:spacing w:line="276" w:lineRule="auto"/>
         <w:ind w:left="720" w:hanging="360"/>
@@ -5833,12 +6029,12 @@
           <wp:inline distB="114300" distT="114300" distL="114300" distR="114300">
             <wp:extent cx="5731200" cy="3073400"/>
             <wp:effectExtent b="0" l="0" r="0" t="0"/>
-            <wp:docPr id="6" name="image19.png"/>
+            <wp:docPr id="5" name="image23.png"/>
             <a:graphic>
               <a:graphicData uri="http://schemas.openxmlformats.org/drawingml/2006/picture">
                 <pic:pic>
                   <pic:nvPicPr>
-                    <pic:cNvPr id="0" name="image19.png"/>
+                    <pic:cNvPr id="0" name="image23.png"/>
                     <pic:cNvPicPr preferRelativeResize="0"/>
                   </pic:nvPicPr>
                   <pic:blipFill>
@@ -6008,7 +6204,7 @@
       <w:pPr>
         <w:numPr>
           <w:ilvl w:val="0"/>
-          <w:numId w:val="8"/>
+          <w:numId w:val="7"/>
         </w:numPr>
         <w:spacing w:line="276" w:lineRule="auto"/>
         <w:ind w:left="720" w:hanging="360"/>
@@ -6037,12 +6233,12 @@
           <wp:inline distB="114300" distT="114300" distL="114300" distR="114300">
             <wp:extent cx="4348163" cy="5944832"/>
             <wp:effectExtent b="0" l="0" r="0" t="0"/>
-            <wp:docPr id="23" name="image12.png"/>
+            <wp:docPr id="21" name="image25.png"/>
             <a:graphic>
               <a:graphicData uri="http://schemas.openxmlformats.org/drawingml/2006/picture">
                 <pic:pic>
                   <pic:nvPicPr>
-                    <pic:cNvPr id="0" name="image12.png"/>
+                    <pic:cNvPr id="0" name="image25.png"/>
                     <pic:cNvPicPr preferRelativeResize="0"/>
                   </pic:nvPicPr>
                   <pic:blipFill>
@@ -6292,12 +6488,12 @@
           <wp:inline distB="114300" distT="114300" distL="114300" distR="114300">
             <wp:extent cx="5731200" cy="3136900"/>
             <wp:effectExtent b="0" l="0" r="0" t="0"/>
-            <wp:docPr id="25" name="image11.png"/>
+            <wp:docPr id="23" name="image29.png"/>
             <a:graphic>
               <a:graphicData uri="http://schemas.openxmlformats.org/drawingml/2006/picture">
                 <pic:pic>
                   <pic:nvPicPr>
-                    <pic:cNvPr id="0" name="image11.png"/>
+                    <pic:cNvPr id="0" name="image29.png"/>
                     <pic:cNvPicPr preferRelativeResize="0"/>
                   </pic:nvPicPr>
                   <pic:blipFill>
@@ -6360,14 +6556,20 @@
         <w:ind w:left="720" w:firstLine="0"/>
         <w:rPr>
           <w:rFonts w:ascii="Times New Roman" w:cs="Times New Roman" w:eastAsia="Times New Roman" w:hAnsi="Times New Roman"/>
-          <w:sz w:val="24"/>
-          <w:szCs w:val="24"/>
-        </w:rPr>
-      </w:pPr>
-      <w:r>
-        <w:rPr>
-          <w:rtl w:val="0"/>
-        </w:rPr>
+          <w:color w:val="980000"/>
+          <w:sz w:val="24"/>
+          <w:szCs w:val="24"/>
+        </w:rPr>
+      </w:pPr>
+      <w:r>
+        <w:rPr>
+          <w:rFonts w:ascii="Times New Roman" w:cs="Times New Roman" w:eastAsia="Times New Roman" w:hAnsi="Times New Roman"/>
+          <w:color w:val="980000"/>
+          <w:sz w:val="24"/>
+          <w:szCs w:val="24"/>
+          <w:rtl w:val="0"/>
+        </w:rPr>
+        <w:t xml:space="preserve">змінити</w:t>
       </w:r>
     </w:p>
     <w:p>
@@ -6522,12 +6724,12 @@
           <wp:inline distB="114300" distT="114300" distL="114300" distR="114300">
             <wp:extent cx="5731200" cy="1460500"/>
             <wp:effectExtent b="0" l="0" r="0" t="0"/>
-            <wp:docPr id="29" name="image25.png"/>
+            <wp:docPr id="28" name="image20.png"/>
             <a:graphic>
               <a:graphicData uri="http://schemas.openxmlformats.org/drawingml/2006/picture">
                 <pic:pic>
                   <pic:nvPicPr>
-                    <pic:cNvPr id="0" name="image25.png"/>
+                    <pic:cNvPr id="0" name="image20.png"/>
                     <pic:cNvPicPr preferRelativeResize="0"/>
                   </pic:nvPicPr>
                   <pic:blipFill>
@@ -6613,12 +6815,12 @@
           <wp:inline distB="114300" distT="114300" distL="114300" distR="114300">
             <wp:extent cx="5731200" cy="1143000"/>
             <wp:effectExtent b="0" l="0" r="0" t="0"/>
-            <wp:docPr id="12" name="image8.png"/>
+            <wp:docPr id="13" name="image9.png"/>
             <a:graphic>
               <a:graphicData uri="http://schemas.openxmlformats.org/drawingml/2006/picture">
                 <pic:pic>
                   <pic:nvPicPr>
-                    <pic:cNvPr id="0" name="image8.png"/>
+                    <pic:cNvPr id="0" name="image9.png"/>
                     <pic:cNvPicPr preferRelativeResize="0"/>
                   </pic:nvPicPr>
                   <pic:blipFill>
@@ -6833,12 +7035,12 @@
           <wp:inline distB="114300" distT="114300" distL="114300" distR="114300">
             <wp:extent cx="5731200" cy="4241800"/>
             <wp:effectExtent b="0" l="0" r="0" t="0"/>
-            <wp:docPr id="5" name="image21.png"/>
+            <wp:docPr id="4" name="image17.png"/>
             <a:graphic>
               <a:graphicData uri="http://schemas.openxmlformats.org/drawingml/2006/picture">
                 <pic:pic>
                   <pic:nvPicPr>
-                    <pic:cNvPr id="0" name="image21.png"/>
+                    <pic:cNvPr id="0" name="image17.png"/>
                     <pic:cNvPicPr preferRelativeResize="0"/>
                   </pic:nvPicPr>
                   <pic:blipFill>
@@ -6872,12 +7074,12 @@
           <wp:inline distB="114300" distT="114300" distL="114300" distR="114300">
             <wp:extent cx="5731200" cy="4051300"/>
             <wp:effectExtent b="0" l="0" r="0" t="0"/>
-            <wp:docPr id="14" name="image29.png"/>
+            <wp:docPr id="15" name="image7.png"/>
             <a:graphic>
               <a:graphicData uri="http://schemas.openxmlformats.org/drawingml/2006/picture">
                 <pic:pic>
                   <pic:nvPicPr>
-                    <pic:cNvPr id="0" name="image29.png"/>
+                    <pic:cNvPr id="0" name="image7.png"/>
                     <pic:cNvPicPr preferRelativeResize="0"/>
                   </pic:nvPicPr>
                   <pic:blipFill>
@@ -6911,12 +7113,12 @@
           <wp:inline distB="114300" distT="114300" distL="114300" distR="114300">
             <wp:extent cx="5731200" cy="4203700"/>
             <wp:effectExtent b="0" l="0" r="0" t="0"/>
-            <wp:docPr id="27" name="image17.png"/>
+            <wp:docPr id="25" name="image13.png"/>
             <a:graphic>
               <a:graphicData uri="http://schemas.openxmlformats.org/drawingml/2006/picture">
                 <pic:pic>
                   <pic:nvPicPr>
-                    <pic:cNvPr id="0" name="image17.png"/>
+                    <pic:cNvPr id="0" name="image13.png"/>
                     <pic:cNvPicPr preferRelativeResize="0"/>
                   </pic:nvPicPr>
                   <pic:blipFill>
@@ -6950,12 +7152,12 @@
           <wp:inline distB="114300" distT="114300" distL="114300" distR="114300">
             <wp:extent cx="5731200" cy="3949700"/>
             <wp:effectExtent b="0" l="0" r="0" t="0"/>
-            <wp:docPr id="19" name="image2.png"/>
+            <wp:docPr id="19" name="image14.png"/>
             <a:graphic>
               <a:graphicData uri="http://schemas.openxmlformats.org/drawingml/2006/picture">
                 <pic:pic>
                   <pic:nvPicPr>
-                    <pic:cNvPr id="0" name="image2.png"/>
+                    <pic:cNvPr id="0" name="image14.png"/>
                     <pic:cNvPicPr preferRelativeResize="0"/>
                   </pic:nvPicPr>
                   <pic:blipFill>
@@ -6989,12 +7191,12 @@
           <wp:inline distB="114300" distT="114300" distL="114300" distR="114300">
             <wp:extent cx="5731200" cy="3848100"/>
             <wp:effectExtent b="0" l="0" r="0" t="0"/>
-            <wp:docPr id="24" name="image9.png"/>
+            <wp:docPr id="22" name="image15.png"/>
             <a:graphic>
               <a:graphicData uri="http://schemas.openxmlformats.org/drawingml/2006/picture">
                 <pic:pic>
                   <pic:nvPicPr>
-                    <pic:cNvPr id="0" name="image9.png"/>
+                    <pic:cNvPr id="0" name="image15.png"/>
                     <pic:cNvPicPr preferRelativeResize="0"/>
                   </pic:nvPicPr>
                   <pic:blipFill>
@@ -7028,12 +7230,12 @@
           <wp:inline distB="114300" distT="114300" distL="114300" distR="114300">
             <wp:extent cx="5731200" cy="3416300"/>
             <wp:effectExtent b="0" l="0" r="0" t="0"/>
-            <wp:docPr id="10" name="image30.png"/>
+            <wp:docPr id="11" name="image6.png"/>
             <a:graphic>
               <a:graphicData uri="http://schemas.openxmlformats.org/drawingml/2006/picture">
                 <pic:pic>
                   <pic:nvPicPr>
-                    <pic:cNvPr id="0" name="image30.png"/>
+                    <pic:cNvPr id="0" name="image6.png"/>
                     <pic:cNvPicPr preferRelativeResize="0"/>
                   </pic:nvPicPr>
                   <pic:blipFill>
@@ -7102,41 +7304,63 @@
           <w:rFonts w:ascii="Times New Roman" w:cs="Times New Roman" w:eastAsia="Times New Roman" w:hAnsi="Times New Roman"/>
           <w:b w:val="1"/>
           <w:bCs w:val="1"/>
-          <w:color w:val="3d85c6"/>
-          <w:sz w:val="24"/>
-          <w:szCs w:val="24"/>
-        </w:rPr>
-      </w:pPr>
-      <w:hyperlink r:id="rId34">
-        <w:r>
-          <w:rPr>
-            <w:rFonts w:ascii="Times New Roman" w:cs="Times New Roman" w:eastAsia="Times New Roman" w:hAnsi="Times New Roman"/>
-            <w:b w:val="1"/>
-            <w:bCs w:val="1"/>
-            <w:color w:val="1155cc"/>
-            <w:sz w:val="24"/>
-            <w:szCs w:val="24"/>
-            <w:u w:val="single"/>
-            <w:rtl w:val="0"/>
-          </w:rPr>
-          <w:t xml:space="preserve">Посилання на файл коду в </w:t>
-        </w:r>
-      </w:hyperlink>
-      <w:hyperlink r:id="rId35">
-        <w:r>
-          <w:rPr>
-            <w:rFonts w:ascii="Times New Roman" w:cs="Times New Roman" w:eastAsia="Times New Roman" w:hAnsi="Times New Roman"/>
-            <w:b w:val="1"/>
-            <w:bCs w:val="1"/>
-            <w:color w:val="1155cc"/>
-            <w:sz w:val="24"/>
-            <w:szCs w:val="24"/>
-            <w:u w:val="single"/>
-            <w:rtl w:val="0"/>
-          </w:rPr>
-          <w:t xml:space="preserve">пулреквесті</w:t>
-        </w:r>
-      </w:hyperlink>
+          <w:sz w:val="24"/>
+          <w:szCs w:val="24"/>
+        </w:rPr>
+      </w:pPr>
+      <w:r>
+        <w:rPr>
+          <w:rFonts w:ascii="Times New Roman" w:cs="Times New Roman" w:eastAsia="Times New Roman" w:hAnsi="Times New Roman"/>
+          <w:b w:val="1"/>
+          <w:bCs w:val="1"/>
+          <w:sz w:val="24"/>
+          <w:szCs w:val="24"/>
+          <w:rtl w:val="0"/>
+        </w:rPr>
+        <w:t xml:space="preserve">Посилання на файл коду в </w:t>
+      </w:r>
+      <w:r>
+        <w:rPr>
+          <w:rFonts w:ascii="Times New Roman" w:cs="Times New Roman" w:eastAsia="Times New Roman" w:hAnsi="Times New Roman"/>
+          <w:b w:val="1"/>
+          <w:bCs w:val="1"/>
+          <w:sz w:val="24"/>
+          <w:szCs w:val="24"/>
+          <w:rtl w:val="0"/>
+        </w:rPr>
+        <w:t xml:space="preserve">пулреквесті</w:t>
+      </w:r>
+      <w:r>
+        <w:rPr>
+          <w:rFonts w:ascii="Times New Roman" w:cs="Times New Roman" w:eastAsia="Times New Roman" w:hAnsi="Times New Roman"/>
+          <w:b w:val="1"/>
+          <w:bCs w:val="1"/>
+          <w:sz w:val="24"/>
+          <w:szCs w:val="24"/>
+          <w:rtl w:val="0"/>
+        </w:rPr>
+        <w:t xml:space="preserve">:</w:t>
+      </w:r>
+    </w:p>
+    <w:p>
+      <w:pPr>
+        <w:spacing w:after="200" w:line="276" w:lineRule="auto"/>
+        <w:jc w:val="both"/>
+        <w:rPr>
+          <w:rFonts w:ascii="Times New Roman" w:cs="Times New Roman" w:eastAsia="Times New Roman" w:hAnsi="Times New Roman"/>
+          <w:sz w:val="24"/>
+          <w:szCs w:val="24"/>
+        </w:rPr>
+      </w:pPr>
+      <w:r>
+        <w:rPr>
+          <w:rFonts w:ascii="Times New Roman" w:cs="Times New Roman" w:eastAsia="Times New Roman" w:hAnsi="Times New Roman"/>
+          <w:sz w:val="24"/>
+          <w:szCs w:val="24"/>
+          <w:rtl w:val="0"/>
+        </w:rPr>
+        <w:t xml:space="preserve">https://github.com/artificial-intelligence-department/ai_programming_playground_2026/pull/48/changes#diff-903cb7b056dadabf3f66a3e6a042dd1c27a4bad5e2f30b1b5c9bf90db71f371c</w:t>
+      </w:r>
       <w:r>
         <w:rPr>
           <w:rtl w:val="0"/>
@@ -7244,16 +7468,16 @@
           <wp:inline distB="114300" distT="114300" distL="114300" distR="114300">
             <wp:extent cx="5731200" cy="2501900"/>
             <wp:effectExtent b="0" l="0" r="0" t="0"/>
-            <wp:docPr id="28" name="image26.png"/>
+            <wp:docPr id="27" name="image22.png"/>
             <a:graphic>
               <a:graphicData uri="http://schemas.openxmlformats.org/drawingml/2006/picture">
                 <pic:pic>
                   <pic:nvPicPr>
-                    <pic:cNvPr id="0" name="image26.png"/>
+                    <pic:cNvPr id="0" name="image22.png"/>
                     <pic:cNvPicPr preferRelativeResize="0"/>
                   </pic:nvPicPr>
                   <pic:blipFill>
-                    <a:blip r:embed="rId36"/>
+                    <a:blip r:embed="rId34"/>
                     <a:srcRect b="0" l="0" r="0" t="0"/>
                     <a:stretch>
                       <a:fillRect/>
@@ -7336,36 +7560,28 @@
           <w:szCs w:val="24"/>
         </w:rPr>
       </w:pPr>
-      <w:hyperlink r:id="rId37">
-        <w:r>
-          <w:rPr>
-            <w:rFonts w:ascii="Times New Roman" w:cs="Times New Roman" w:eastAsia="Times New Roman" w:hAnsi="Times New Roman"/>
-            <w:b w:val="1"/>
-            <w:bCs w:val="1"/>
-            <w:color w:val="1155cc"/>
-            <w:sz w:val="24"/>
-            <w:szCs w:val="24"/>
-            <w:u w:val="single"/>
-            <w:rtl w:val="0"/>
-          </w:rPr>
-          <w:t xml:space="preserve">Посилання на файл коду в </w:t>
-        </w:r>
-      </w:hyperlink>
-      <w:hyperlink r:id="rId38">
-        <w:r>
-          <w:rPr>
-            <w:rFonts w:ascii="Times New Roman" w:cs="Times New Roman" w:eastAsia="Times New Roman" w:hAnsi="Times New Roman"/>
-            <w:b w:val="1"/>
-            <w:bCs w:val="1"/>
-            <w:color w:val="1155cc"/>
-            <w:sz w:val="24"/>
-            <w:szCs w:val="24"/>
-            <w:u w:val="single"/>
-            <w:rtl w:val="0"/>
-          </w:rPr>
-          <w:t xml:space="preserve">пулреквесті</w:t>
-        </w:r>
-      </w:hyperlink>
+      <w:r>
+        <w:rPr>
+          <w:rFonts w:ascii="Times New Roman" w:cs="Times New Roman" w:eastAsia="Times New Roman" w:hAnsi="Times New Roman"/>
+          <w:b w:val="1"/>
+          <w:bCs w:val="1"/>
+          <w:sz w:val="24"/>
+          <w:szCs w:val="24"/>
+          <w:rtl w:val="0"/>
+        </w:rPr>
+        <w:t xml:space="preserve">Посилання на файл коду в </w:t>
+      </w:r>
+      <w:r>
+        <w:rPr>
+          <w:rFonts w:ascii="Times New Roman" w:cs="Times New Roman" w:eastAsia="Times New Roman" w:hAnsi="Times New Roman"/>
+          <w:b w:val="1"/>
+          <w:bCs w:val="1"/>
+          <w:sz w:val="24"/>
+          <w:szCs w:val="24"/>
+          <w:rtl w:val="0"/>
+        </w:rPr>
+        <w:t xml:space="preserve">пулреквесті</w:t>
+      </w:r>
       <w:r>
         <w:rPr>
           <w:rtl w:val="0"/>
@@ -7384,21 +7600,15 @@
           <w:szCs w:val="24"/>
         </w:rPr>
       </w:pPr>
-      <w:hyperlink r:id="rId39">
-        <w:r>
-          <w:rPr>
-            <w:rFonts w:ascii="Times New Roman" w:cs="Times New Roman" w:eastAsia="Times New Roman" w:hAnsi="Times New Roman"/>
-            <w:i w:val="1"/>
-            <w:iCs w:val="1"/>
-            <w:color w:val="1155cc"/>
-            <w:sz w:val="24"/>
-            <w:szCs w:val="24"/>
-            <w:u w:val="single"/>
-            <w:rtl w:val="0"/>
-          </w:rPr>
-          <w:t xml:space="preserve">Посилання на умову задачі</w:t>
-        </w:r>
-      </w:hyperlink>
+      <w:r>
+        <w:rPr>
+          <w:rFonts w:ascii="Times New Roman" w:cs="Times New Roman" w:eastAsia="Times New Roman" w:hAnsi="Times New Roman"/>
+          <w:sz w:val="24"/>
+          <w:szCs w:val="24"/>
+          <w:rtl w:val="0"/>
+        </w:rPr>
+        <w:t xml:space="preserve">https://github.com/artificial-intelligence-department/ai_programming_playground_2026/pull/48/changes#diff-774c418ed3fb7b3b6b1c0b9ad92b4c14c237633f8054d0e0cb618b5017e34a40</w:t>
+      </w:r>
       <w:r>
         <w:rPr>
           <w:rtl w:val="0"/>
@@ -7437,18 +7647,18 @@
         </w:rPr>
         <w:drawing>
           <wp:inline distB="114300" distT="114300" distL="114300" distR="114300">
-            <wp:extent cx="5731200" cy="3670300"/>
+            <wp:extent cx="5731200" cy="4648200"/>
             <wp:effectExtent b="0" l="0" r="0" t="0"/>
-            <wp:docPr id="20" name="image1.png"/>
+            <wp:docPr id="8" name="image5.png"/>
             <a:graphic>
               <a:graphicData uri="http://schemas.openxmlformats.org/drawingml/2006/picture">
                 <pic:pic>
                   <pic:nvPicPr>
-                    <pic:cNvPr id="0" name="image1.png"/>
+                    <pic:cNvPr id="0" name="image5.png"/>
                     <pic:cNvPicPr preferRelativeResize="0"/>
                   </pic:nvPicPr>
                   <pic:blipFill>
-                    <a:blip r:embed="rId40"/>
+                    <a:blip r:embed="rId35"/>
                     <a:srcRect b="0" l="0" r="0" t="0"/>
                     <a:stretch>
                       <a:fillRect/>
@@ -7457,7 +7667,7 @@
                   <pic:spPr>
                     <a:xfrm>
                       <a:off x="0" y="0"/>
-                      <a:ext cx="5731200" cy="3670300"/>
+                      <a:ext cx="5731200" cy="4648200"/>
                     </a:xfrm>
                     <a:prstGeom prst="rect"/>
                     <a:ln/>
@@ -7568,36 +7778,30 @@
           <w:szCs w:val="24"/>
         </w:rPr>
       </w:pPr>
-      <w:hyperlink r:id="rId41">
-        <w:r>
-          <w:rPr>
-            <w:rFonts w:ascii="Times New Roman" w:cs="Times New Roman" w:eastAsia="Times New Roman" w:hAnsi="Times New Roman"/>
-            <w:b w:val="1"/>
-            <w:bCs w:val="1"/>
-            <w:color w:val="1155cc"/>
-            <w:sz w:val="24"/>
-            <w:szCs w:val="24"/>
-            <w:u w:val="single"/>
-            <w:rtl w:val="0"/>
-          </w:rPr>
-          <w:t xml:space="preserve">Посилання на файл коду в </w:t>
-        </w:r>
-      </w:hyperlink>
-      <w:hyperlink r:id="rId42">
-        <w:r>
-          <w:rPr>
-            <w:rFonts w:ascii="Times New Roman" w:cs="Times New Roman" w:eastAsia="Times New Roman" w:hAnsi="Times New Roman"/>
-            <w:b w:val="1"/>
-            <w:bCs w:val="1"/>
-            <w:color w:val="1155cc"/>
-            <w:sz w:val="24"/>
-            <w:szCs w:val="24"/>
-            <w:u w:val="single"/>
-            <w:rtl w:val="0"/>
-          </w:rPr>
-          <w:t xml:space="preserve">пулреквесті</w:t>
-        </w:r>
-      </w:hyperlink>
+      <w:r>
+        <w:rPr>
+          <w:rFonts w:ascii="Times New Roman" w:cs="Times New Roman" w:eastAsia="Times New Roman" w:hAnsi="Times New Roman"/>
+          <w:b w:val="1"/>
+          <w:bCs w:val="1"/>
+          <w:color w:val="3d85c6"/>
+          <w:sz w:val="24"/>
+          <w:szCs w:val="24"/>
+          <w:rtl w:val="0"/>
+        </w:rPr>
+        <w:t xml:space="preserve">Посилання на файл коду в </w:t>
+      </w:r>
+      <w:r>
+        <w:rPr>
+          <w:rFonts w:ascii="Times New Roman" w:cs="Times New Roman" w:eastAsia="Times New Roman" w:hAnsi="Times New Roman"/>
+          <w:b w:val="1"/>
+          <w:bCs w:val="1"/>
+          <w:color w:val="3d85c6"/>
+          <w:sz w:val="24"/>
+          <w:szCs w:val="24"/>
+          <w:rtl w:val="0"/>
+        </w:rPr>
+        <w:t xml:space="preserve">пулреквесті</w:t>
+      </w:r>
       <w:r>
         <w:rPr>
           <w:rtl w:val="0"/>
@@ -7617,21 +7821,15 @@
           <w:szCs w:val="24"/>
         </w:rPr>
       </w:pPr>
-      <w:hyperlink r:id="rId43">
-        <w:r>
-          <w:rPr>
-            <w:rFonts w:ascii="Times New Roman" w:cs="Times New Roman" w:eastAsia="Times New Roman" w:hAnsi="Times New Roman"/>
-            <w:i w:val="1"/>
-            <w:iCs w:val="1"/>
-            <w:color w:val="1155cc"/>
-            <w:sz w:val="24"/>
-            <w:szCs w:val="24"/>
-            <w:u w:val="single"/>
-            <w:rtl w:val="0"/>
-          </w:rPr>
-          <w:t xml:space="preserve">Посилання на умову задачі</w:t>
-        </w:r>
-      </w:hyperlink>
+      <w:r>
+        <w:rPr>
+          <w:rFonts w:ascii="Times New Roman" w:cs="Times New Roman" w:eastAsia="Times New Roman" w:hAnsi="Times New Roman"/>
+          <w:sz w:val="24"/>
+          <w:szCs w:val="24"/>
+          <w:rtl w:val="0"/>
+        </w:rPr>
+        <w:t xml:space="preserve">https://github.com/artificial-intelligence-department/ai_programming_playground_2026/pull/48/changes#diff-7d274d9bc7fe21ea3ecb151b5e89cb7b4c9dbbbbbd4613780c6dfc2713fdaf81</w:t>
+      </w:r>
       <w:r>
         <w:rPr>
           <w:rtl w:val="0"/>
@@ -7691,16 +7889,16 @@
           <wp:inline distB="114300" distT="114300" distL="114300" distR="114300">
             <wp:extent cx="5731200" cy="5118100"/>
             <wp:effectExtent b="0" l="0" r="0" t="0"/>
-            <wp:docPr id="16" name="image15.png"/>
+            <wp:docPr id="16" name="image2.png"/>
             <a:graphic>
               <a:graphicData uri="http://schemas.openxmlformats.org/drawingml/2006/picture">
                 <pic:pic>
                   <pic:nvPicPr>
-                    <pic:cNvPr id="0" name="image15.png"/>
+                    <pic:cNvPr id="0" name="image2.png"/>
                     <pic:cNvPicPr preferRelativeResize="0"/>
                   </pic:nvPicPr>
                   <pic:blipFill>
-                    <a:blip r:embed="rId44"/>
+                    <a:blip r:embed="rId36"/>
                     <a:srcRect b="0" l="0" r="0" t="0"/>
                     <a:stretch>
                       <a:fillRect/>
@@ -7732,16 +7930,16 @@
           <wp:inline distB="114300" distT="114300" distL="114300" distR="114300">
             <wp:extent cx="5731200" cy="5753100"/>
             <wp:effectExtent b="0" l="0" r="0" t="0"/>
-            <wp:docPr id="17" name="image20.png"/>
+            <wp:docPr id="18" name="image28.png"/>
             <a:graphic>
               <a:graphicData uri="http://schemas.openxmlformats.org/drawingml/2006/picture">
                 <pic:pic>
                   <pic:nvPicPr>
-                    <pic:cNvPr id="0" name="image20.png"/>
+                    <pic:cNvPr id="0" name="image28.png"/>
                     <pic:cNvPicPr preferRelativeResize="0"/>
                   </pic:nvPicPr>
                   <pic:blipFill>
-                    <a:blip r:embed="rId45"/>
+                    <a:blip r:embed="rId37"/>
                     <a:srcRect b="0" l="0" r="0" t="0"/>
                     <a:stretch>
                       <a:fillRect/>
@@ -7821,36 +8019,28 @@
           <w:szCs w:val="24"/>
         </w:rPr>
       </w:pPr>
-      <w:hyperlink r:id="rId46">
-        <w:r>
-          <w:rPr>
-            <w:rFonts w:ascii="Times New Roman" w:cs="Times New Roman" w:eastAsia="Times New Roman" w:hAnsi="Times New Roman"/>
-            <w:b w:val="1"/>
-            <w:bCs w:val="1"/>
-            <w:color w:val="1155cc"/>
-            <w:sz w:val="24"/>
-            <w:szCs w:val="24"/>
-            <w:u w:val="single"/>
-            <w:rtl w:val="0"/>
-          </w:rPr>
-          <w:t xml:space="preserve">Посилання на файл коду в </w:t>
-        </w:r>
-      </w:hyperlink>
-      <w:hyperlink r:id="rId47">
-        <w:r>
-          <w:rPr>
-            <w:rFonts w:ascii="Times New Roman" w:cs="Times New Roman" w:eastAsia="Times New Roman" w:hAnsi="Times New Roman"/>
-            <w:b w:val="1"/>
-            <w:bCs w:val="1"/>
-            <w:color w:val="1155cc"/>
-            <w:sz w:val="24"/>
-            <w:szCs w:val="24"/>
-            <w:u w:val="single"/>
-            <w:rtl w:val="0"/>
-          </w:rPr>
-          <w:t xml:space="preserve">пулреквесті</w:t>
-        </w:r>
-      </w:hyperlink>
+      <w:r>
+        <w:rPr>
+          <w:rFonts w:ascii="Times New Roman" w:cs="Times New Roman" w:eastAsia="Times New Roman" w:hAnsi="Times New Roman"/>
+          <w:b w:val="1"/>
+          <w:bCs w:val="1"/>
+          <w:sz w:val="24"/>
+          <w:szCs w:val="24"/>
+          <w:rtl w:val="0"/>
+        </w:rPr>
+        <w:t xml:space="preserve">Посилання на файл коду в </w:t>
+      </w:r>
+      <w:r>
+        <w:rPr>
+          <w:rFonts w:ascii="Times New Roman" w:cs="Times New Roman" w:eastAsia="Times New Roman" w:hAnsi="Times New Roman"/>
+          <w:b w:val="1"/>
+          <w:bCs w:val="1"/>
+          <w:sz w:val="24"/>
+          <w:szCs w:val="24"/>
+          <w:rtl w:val="0"/>
+        </w:rPr>
+        <w:t xml:space="preserve">пулреквесті</w:t>
+      </w:r>
       <w:r>
         <w:rPr>
           <w:rtl w:val="0"/>
@@ -7868,21 +8058,15 @@
           <w:szCs w:val="24"/>
         </w:rPr>
       </w:pPr>
-      <w:hyperlink r:id="rId48">
-        <w:r>
-          <w:rPr>
-            <w:rFonts w:ascii="Times New Roman" w:cs="Times New Roman" w:eastAsia="Times New Roman" w:hAnsi="Times New Roman"/>
-            <w:i w:val="1"/>
-            <w:iCs w:val="1"/>
-            <w:color w:val="1155cc"/>
-            <w:sz w:val="24"/>
-            <w:szCs w:val="24"/>
-            <w:u w:val="single"/>
-            <w:rtl w:val="0"/>
-          </w:rPr>
-          <w:t xml:space="preserve">Посилання на умову задачі</w:t>
-        </w:r>
-      </w:hyperlink>
+      <w:r>
+        <w:rPr>
+          <w:rFonts w:ascii="Times New Roman" w:cs="Times New Roman" w:eastAsia="Times New Roman" w:hAnsi="Times New Roman"/>
+          <w:sz w:val="24"/>
+          <w:szCs w:val="24"/>
+          <w:rtl w:val="0"/>
+        </w:rPr>
+        <w:t xml:space="preserve">https://github.com/artificial-intelligence-department/ai_programming_playground_2026/pull/48/changes#diff-22b9a6606c133e5fbcae12493fb5c2fe1209de380c34d9d533b18760a1382b4f</w:t>
+      </w:r>
       <w:r>
         <w:rPr>
           <w:rtl w:val="0"/>
@@ -7923,16 +8107,16 @@
           <wp:inline distB="114300" distT="114300" distL="114300" distR="114300">
             <wp:extent cx="5731200" cy="3860800"/>
             <wp:effectExtent b="0" l="0" r="0" t="0"/>
-            <wp:docPr id="2" name="image5.png"/>
+            <wp:docPr id="2" name="image3.png"/>
             <a:graphic>
               <a:graphicData uri="http://schemas.openxmlformats.org/drawingml/2006/picture">
                 <pic:pic>
                   <pic:nvPicPr>
-                    <pic:cNvPr id="0" name="image5.png"/>
+                    <pic:cNvPr id="0" name="image3.png"/>
                     <pic:cNvPicPr preferRelativeResize="0"/>
                   </pic:nvPicPr>
                   <pic:blipFill>
-                    <a:blip r:embed="rId49"/>
+                    <a:blip r:embed="rId38"/>
                     <a:srcRect b="0" l="0" r="0" t="0"/>
                     <a:stretch>
                       <a:fillRect/>
@@ -8012,36 +8196,28 @@
           <w:szCs w:val="24"/>
         </w:rPr>
       </w:pPr>
-      <w:hyperlink r:id="rId50">
-        <w:r>
-          <w:rPr>
-            <w:rFonts w:ascii="Times New Roman" w:cs="Times New Roman" w:eastAsia="Times New Roman" w:hAnsi="Times New Roman"/>
-            <w:b w:val="1"/>
-            <w:bCs w:val="1"/>
-            <w:color w:val="1155cc"/>
-            <w:sz w:val="24"/>
-            <w:szCs w:val="24"/>
-            <w:u w:val="single"/>
-            <w:rtl w:val="0"/>
-          </w:rPr>
-          <w:t xml:space="preserve">Посилання на файл коду в </w:t>
-        </w:r>
-      </w:hyperlink>
-      <w:hyperlink r:id="rId51">
-        <w:r>
-          <w:rPr>
-            <w:rFonts w:ascii="Times New Roman" w:cs="Times New Roman" w:eastAsia="Times New Roman" w:hAnsi="Times New Roman"/>
-            <w:b w:val="1"/>
-            <w:bCs w:val="1"/>
-            <w:color w:val="1155cc"/>
-            <w:sz w:val="24"/>
-            <w:szCs w:val="24"/>
-            <w:u w:val="single"/>
-            <w:rtl w:val="0"/>
-          </w:rPr>
-          <w:t xml:space="preserve">пулреквесті</w:t>
-        </w:r>
-      </w:hyperlink>
+      <w:r>
+        <w:rPr>
+          <w:rFonts w:ascii="Times New Roman" w:cs="Times New Roman" w:eastAsia="Times New Roman" w:hAnsi="Times New Roman"/>
+          <w:b w:val="1"/>
+          <w:bCs w:val="1"/>
+          <w:sz w:val="24"/>
+          <w:szCs w:val="24"/>
+          <w:rtl w:val="0"/>
+        </w:rPr>
+        <w:t xml:space="preserve">Посилання на файл коду в </w:t>
+      </w:r>
+      <w:r>
+        <w:rPr>
+          <w:rFonts w:ascii="Times New Roman" w:cs="Times New Roman" w:eastAsia="Times New Roman" w:hAnsi="Times New Roman"/>
+          <w:b w:val="1"/>
+          <w:bCs w:val="1"/>
+          <w:sz w:val="24"/>
+          <w:szCs w:val="24"/>
+          <w:rtl w:val="0"/>
+        </w:rPr>
+        <w:t xml:space="preserve">пулреквесті</w:t>
+      </w:r>
       <w:r>
         <w:rPr>
           <w:rtl w:val="0"/>
@@ -8059,21 +8235,15 @@
           <w:szCs w:val="24"/>
         </w:rPr>
       </w:pPr>
-      <w:hyperlink r:id="rId52">
-        <w:r>
-          <w:rPr>
-            <w:rFonts w:ascii="Times New Roman" w:cs="Times New Roman" w:eastAsia="Times New Roman" w:hAnsi="Times New Roman"/>
-            <w:i w:val="1"/>
-            <w:iCs w:val="1"/>
-            <w:color w:val="1155cc"/>
-            <w:sz w:val="24"/>
-            <w:szCs w:val="24"/>
-            <w:u w:val="single"/>
-            <w:rtl w:val="0"/>
-          </w:rPr>
-          <w:t xml:space="preserve">Посилання на умову задачі</w:t>
-        </w:r>
-      </w:hyperlink>
+      <w:r>
+        <w:rPr>
+          <w:rFonts w:ascii="Times New Roman" w:cs="Times New Roman" w:eastAsia="Times New Roman" w:hAnsi="Times New Roman"/>
+          <w:sz w:val="24"/>
+          <w:szCs w:val="24"/>
+          <w:rtl w:val="0"/>
+        </w:rPr>
+        <w:t xml:space="preserve">https://github.com/artificial-intelligence-department/ai_programming_playground_2026/pull/48/changes#diff-b54f0e6beafde4a3add023101172378534aef30625418b66e87568cf693dfad0</w:t>
+      </w:r>
       <w:r>
         <w:rPr>
           <w:rtl w:val="0"/>
@@ -8165,16 +8335,16 @@
           <wp:inline distB="114300" distT="114300" distL="114300" distR="114300">
             <wp:extent cx="5731200" cy="2425700"/>
             <wp:effectExtent b="0" l="0" r="0" t="0"/>
-            <wp:docPr id="11" name="image27.png"/>
+            <wp:docPr id="12" name="image4.png"/>
             <a:graphic>
               <a:graphicData uri="http://schemas.openxmlformats.org/drawingml/2006/picture">
                 <pic:pic>
                   <pic:nvPicPr>
-                    <pic:cNvPr id="0" name="image27.png"/>
+                    <pic:cNvPr id="0" name="image4.png"/>
                     <pic:cNvPicPr preferRelativeResize="0"/>
                   </pic:nvPicPr>
                   <pic:blipFill>
-                    <a:blip r:embed="rId53"/>
+                    <a:blip r:embed="rId39"/>
                     <a:srcRect b="0" l="0" r="0" t="0"/>
                     <a:stretch>
                       <a:fillRect/>
@@ -8281,6 +8451,26 @@
           <w:szCs w:val="24"/>
           <w:rtl w:val="0"/>
         </w:rPr>
+        <w:t xml:space="preserve">Фактично витрачений час: 4 год.</w:t>
+      </w:r>
+    </w:p>
+    <w:p>
+      <w:pPr>
+        <w:spacing w:after="200" w:line="276" w:lineRule="auto"/>
+        <w:jc w:val="both"/>
+        <w:rPr>
+          <w:rFonts w:ascii="Times New Roman" w:cs="Times New Roman" w:eastAsia="Times New Roman" w:hAnsi="Times New Roman"/>
+          <w:sz w:val="24"/>
+          <w:szCs w:val="24"/>
+        </w:rPr>
+      </w:pPr>
+      <w:r>
+        <w:rPr>
+          <w:rFonts w:ascii="Times New Roman" w:cs="Times New Roman" w:eastAsia="Times New Roman" w:hAnsi="Times New Roman"/>
+          <w:sz w:val="24"/>
+          <w:szCs w:val="24"/>
+          <w:rtl w:val="0"/>
+        </w:rPr>
         <w:t xml:space="preserve">Виконання задачі №0001:</w:t>
       </w:r>
     </w:p>
@@ -8305,16 +8495,16 @@
           <wp:inline distB="114300" distT="114300" distL="114300" distR="114300">
             <wp:extent cx="5731200" cy="4229100"/>
             <wp:effectExtent b="0" l="0" r="0" t="0"/>
-            <wp:docPr id="26" name="image16.png"/>
+            <wp:docPr id="24" name="image18.png"/>
             <a:graphic>
               <a:graphicData uri="http://schemas.openxmlformats.org/drawingml/2006/picture">
                 <pic:pic>
                   <pic:nvPicPr>
-                    <pic:cNvPr id="0" name="image16.png"/>
+                    <pic:cNvPr id="0" name="image18.png"/>
                     <pic:cNvPicPr preferRelativeResize="0"/>
                   </pic:nvPicPr>
                   <pic:blipFill>
-                    <a:blip r:embed="rId54"/>
+                    <a:blip r:embed="rId40"/>
                     <a:srcRect b="0" l="0" r="0" t="0"/>
                     <a:stretch>
                       <a:fillRect/>
@@ -8421,7 +8611,7 @@
           <w:szCs w:val="24"/>
           <w:rtl w:val="0"/>
         </w:rPr>
-        <w:t xml:space="preserve">Виконання задачі №0011:</w:t>
+        <w:t xml:space="preserve">Фактично витрачений час: 10 хв.</w:t>
       </w:r>
     </w:p>
     <w:p>
@@ -8439,21 +8629,41 @@
           <w:rFonts w:ascii="Times New Roman" w:cs="Times New Roman" w:eastAsia="Times New Roman" w:hAnsi="Times New Roman"/>
           <w:sz w:val="24"/>
           <w:szCs w:val="24"/>
+          <w:rtl w:val="0"/>
+        </w:rPr>
+        <w:t xml:space="preserve">Виконання задачі №0011:</w:t>
+      </w:r>
+    </w:p>
+    <w:p>
+      <w:pPr>
+        <w:spacing w:after="200" w:line="276" w:lineRule="auto"/>
+        <w:jc w:val="both"/>
+        <w:rPr>
+          <w:rFonts w:ascii="Times New Roman" w:cs="Times New Roman" w:eastAsia="Times New Roman" w:hAnsi="Times New Roman"/>
+          <w:sz w:val="24"/>
+          <w:szCs w:val="24"/>
+        </w:rPr>
+      </w:pPr>
+      <w:r>
+        <w:rPr>
+          <w:rFonts w:ascii="Times New Roman" w:cs="Times New Roman" w:eastAsia="Times New Roman" w:hAnsi="Times New Roman"/>
+          <w:sz w:val="24"/>
+          <w:szCs w:val="24"/>
         </w:rPr>
         <w:drawing>
           <wp:inline distB="114300" distT="114300" distL="114300" distR="114300">
-            <wp:extent cx="5731200" cy="4584700"/>
+            <wp:extent cx="5731200" cy="4508500"/>
             <wp:effectExtent b="0" l="0" r="0" t="0"/>
-            <wp:docPr id="30" name="image22.png"/>
+            <wp:docPr id="26" name="image21.png"/>
             <a:graphic>
               <a:graphicData uri="http://schemas.openxmlformats.org/drawingml/2006/picture">
                 <pic:pic>
                   <pic:nvPicPr>
-                    <pic:cNvPr id="0" name="image22.png"/>
+                    <pic:cNvPr id="0" name="image21.png"/>
                     <pic:cNvPicPr preferRelativeResize="0"/>
                   </pic:nvPicPr>
                   <pic:blipFill>
-                    <a:blip r:embed="rId55"/>
+                    <a:blip r:embed="rId41"/>
                     <a:srcRect b="0" l="0" r="0" t="0"/>
                     <a:stretch>
                       <a:fillRect/>
@@ -8462,7 +8672,7 @@
                   <pic:spPr>
                     <a:xfrm>
                       <a:off x="0" y="0"/>
-                      <a:ext cx="5731200" cy="4584700"/>
+                      <a:ext cx="5731200" cy="4508500"/>
                     </a:xfrm>
                     <a:prstGeom prst="rect"/>
                     <a:ln/>
@@ -8560,6 +8770,26 @@
           <w:szCs w:val="24"/>
           <w:rtl w:val="0"/>
         </w:rPr>
+        <w:t xml:space="preserve">Фактично витрачений час: 30 хв.</w:t>
+      </w:r>
+    </w:p>
+    <w:p>
+      <w:pPr>
+        <w:spacing w:after="200" w:line="276" w:lineRule="auto"/>
+        <w:jc w:val="both"/>
+        <w:rPr>
+          <w:rFonts w:ascii="Times New Roman" w:cs="Times New Roman" w:eastAsia="Times New Roman" w:hAnsi="Times New Roman"/>
+          <w:sz w:val="24"/>
+          <w:szCs w:val="24"/>
+        </w:rPr>
+      </w:pPr>
+      <w:r>
+        <w:rPr>
+          <w:rFonts w:ascii="Times New Roman" w:cs="Times New Roman" w:eastAsia="Times New Roman" w:hAnsi="Times New Roman"/>
+          <w:sz w:val="24"/>
+          <w:szCs w:val="24"/>
+          <w:rtl w:val="0"/>
+        </w:rPr>
         <w:t xml:space="preserve">Виконання задачі №0023:</w:t>
       </w:r>
     </w:p>
@@ -8583,16 +8813,16 @@
           <wp:inline distB="114300" distT="114300" distL="114300" distR="114300">
             <wp:extent cx="5731200" cy="4279900"/>
             <wp:effectExtent b="0" l="0" r="0" t="0"/>
-            <wp:docPr id="8" name="image14.png"/>
+            <wp:docPr id="7" name="image11.png"/>
             <a:graphic>
               <a:graphicData uri="http://schemas.openxmlformats.org/drawingml/2006/picture">
                 <pic:pic>
                   <pic:nvPicPr>
-                    <pic:cNvPr id="0" name="image14.png"/>
+                    <pic:cNvPr id="0" name="image11.png"/>
                     <pic:cNvPicPr preferRelativeResize="0"/>
                   </pic:nvPicPr>
                   <pic:blipFill>
-                    <a:blip r:embed="rId56"/>
+                    <a:blip r:embed="rId42"/>
                     <a:srcRect b="0" l="0" r="0" t="0"/>
                     <a:stretch>
                       <a:fillRect/>
@@ -8699,6 +8929,26 @@
           <w:szCs w:val="24"/>
           <w:rtl w:val="0"/>
         </w:rPr>
+        <w:t xml:space="preserve">Фактично витрачений час: 30 хв.</w:t>
+      </w:r>
+    </w:p>
+    <w:p>
+      <w:pPr>
+        <w:spacing w:after="200" w:line="276" w:lineRule="auto"/>
+        <w:jc w:val="both"/>
+        <w:rPr>
+          <w:rFonts w:ascii="Times New Roman" w:cs="Times New Roman" w:eastAsia="Times New Roman" w:hAnsi="Times New Roman"/>
+          <w:sz w:val="24"/>
+          <w:szCs w:val="24"/>
+        </w:rPr>
+      </w:pPr>
+      <w:r>
+        <w:rPr>
+          <w:rFonts w:ascii="Times New Roman" w:cs="Times New Roman" w:eastAsia="Times New Roman" w:hAnsi="Times New Roman"/>
+          <w:sz w:val="24"/>
+          <w:szCs w:val="24"/>
+          <w:rtl w:val="0"/>
+        </w:rPr>
         <w:t xml:space="preserve">Виконання задачі №0181:</w:t>
       </w:r>
     </w:p>
@@ -8722,16 +8972,16 @@
           <wp:inline distB="114300" distT="114300" distL="114300" distR="114300">
             <wp:extent cx="5731200" cy="4254500"/>
             <wp:effectExtent b="0" l="0" r="0" t="0"/>
-            <wp:docPr id="13" name="image13.png"/>
+            <wp:docPr id="14" name="image10.png"/>
             <a:graphic>
               <a:graphicData uri="http://schemas.openxmlformats.org/drawingml/2006/picture">
                 <pic:pic>
                   <pic:nvPicPr>
-                    <pic:cNvPr id="0" name="image13.png"/>
+                    <pic:cNvPr id="0" name="image10.png"/>
                     <pic:cNvPicPr preferRelativeResize="0"/>
                   </pic:nvPicPr>
                   <pic:blipFill>
-                    <a:blip r:embed="rId57"/>
+                    <a:blip r:embed="rId43"/>
                     <a:srcRect b="0" l="0" r="0" t="0"/>
                     <a:stretch>
                       <a:fillRect/>
@@ -8824,20 +9074,46 @@
     <w:p>
       <w:pPr>
         <w:spacing w:after="200" w:line="276" w:lineRule="auto"/>
-        <w:rPr>
-          <w:rFonts w:ascii="Times New Roman" w:cs="Times New Roman" w:eastAsia="Times New Roman" w:hAnsi="Times New Roman"/>
-          <w:sz w:val="24"/>
-          <w:szCs w:val="24"/>
-        </w:rPr>
-      </w:pPr>
-      <w:r>
-        <w:rPr>
-          <w:rFonts w:ascii="Times New Roman" w:cs="Times New Roman" w:eastAsia="Times New Roman" w:hAnsi="Times New Roman"/>
-          <w:sz w:val="24"/>
-          <w:szCs w:val="24"/>
-          <w:rtl w:val="0"/>
-        </w:rPr>
-        <w:t xml:space="preserve">Фактичний час, який витратили на виконання всього завдання: 3 дні. </w:t>
+        <w:jc w:val="both"/>
+        <w:rPr>
+          <w:rFonts w:ascii="Times New Roman" w:cs="Times New Roman" w:eastAsia="Times New Roman" w:hAnsi="Times New Roman"/>
+          <w:sz w:val="24"/>
+          <w:szCs w:val="24"/>
+        </w:rPr>
+      </w:pPr>
+      <w:r>
+        <w:rPr>
+          <w:rFonts w:ascii="Times New Roman" w:cs="Times New Roman" w:eastAsia="Times New Roman" w:hAnsi="Times New Roman"/>
+          <w:sz w:val="24"/>
+          <w:szCs w:val="24"/>
+          <w:rtl w:val="0"/>
+        </w:rPr>
+        <w:t xml:space="preserve">Фактично витрачений час: 10 хв.</w:t>
+      </w:r>
+    </w:p>
+    <w:p>
+      <w:pPr>
+        <w:spacing w:after="200" w:line="276" w:lineRule="auto"/>
+        <w:rPr>
+          <w:rFonts w:ascii="Times New Roman" w:cs="Times New Roman" w:eastAsia="Times New Roman" w:hAnsi="Times New Roman"/>
+          <w:color w:val="980000"/>
+          <w:sz w:val="24"/>
+          <w:szCs w:val="24"/>
+        </w:rPr>
+      </w:pPr>
+      <w:r>
+        <w:rPr>
+          <w:rFonts w:ascii="Times New Roman" w:cs="Times New Roman" w:eastAsia="Times New Roman" w:hAnsi="Times New Roman"/>
+          <w:sz w:val="24"/>
+          <w:szCs w:val="24"/>
+          <w:rtl w:val="0"/>
+        </w:rPr>
+        <w:t xml:space="preserve">Фактичний час, який витратив на виконання всіх завдань: 3 дні. </w:t>
+      </w:r>
+      <w:r>
+        <w:rPr>
+          <w:rtl w:val="0"/>
+        </w:rPr>
       </w:r>
     </w:p>
     <w:p>
@@ -8873,7 +9149,7 @@
       <w:pPr>
         <w:numPr>
           <w:ilvl w:val="0"/>
-          <w:numId w:val="14"/>
+          <w:numId w:val="13"/>
         </w:numPr>
         <w:spacing w:line="276" w:lineRule="auto"/>
         <w:ind w:left="720" w:hanging="360"/>
@@ -8947,16 +9223,16 @@
           <wp:inline distB="114300" distT="114300" distL="114300" distR="114300">
             <wp:extent cx="5731200" cy="2222500"/>
             <wp:effectExtent b="0" l="0" r="0" t="0"/>
-            <wp:docPr id="21" name="image18.png"/>
+            <wp:docPr id="20" name="image19.png"/>
             <a:graphic>
               <a:graphicData uri="http://schemas.openxmlformats.org/drawingml/2006/picture">
                 <pic:pic>
                   <pic:nvPicPr>
-                    <pic:cNvPr id="0" name="image18.png"/>
+                    <pic:cNvPr id="0" name="image19.png"/>
                     <pic:cNvPicPr preferRelativeResize="0"/>
                   </pic:nvPicPr>
                   <pic:blipFill>
-                    <a:blip r:embed="rId58"/>
+                    <a:blip r:embed="rId44"/>
                     <a:srcRect b="0" l="0" r="0" t="0"/>
                     <a:stretch>
                       <a:fillRect/>
@@ -9029,16 +9305,16 @@
           <wp:inline distB="114300" distT="114300" distL="114300" distR="114300">
             <wp:extent cx="5731200" cy="2565400"/>
             <wp:effectExtent b="0" l="0" r="0" t="0"/>
-            <wp:docPr id="1" name="image24.png"/>
+            <wp:docPr id="1" name="image1.png"/>
             <a:graphic>
               <a:graphicData uri="http://schemas.openxmlformats.org/drawingml/2006/picture">
                 <pic:pic>
                   <pic:nvPicPr>
-                    <pic:cNvPr id="0" name="image24.png"/>
+                    <pic:cNvPr id="0" name="image1.png"/>
                     <pic:cNvPicPr preferRelativeResize="0"/>
                   </pic:nvPicPr>
                   <pic:blipFill>
-                    <a:blip r:embed="rId59"/>
+                    <a:blip r:embed="rId45"/>
                     <a:srcRect b="0" l="0" r="0" t="0"/>
                     <a:stretch>
                       <a:fillRect/>
@@ -9176,7 +9452,8 @@
     </w:p>
     <w:p>
       <w:pPr>
-        <w:spacing w:after="240" w:before="240" w:line="276" w:lineRule="auto"/>
+        <w:spacing w:after="240" w:line="276" w:lineRule="auto"/>
+        <w:ind w:left="720" w:firstLine="0"/>
         <w:jc w:val="both"/>
         <w:rPr>
           <w:rFonts w:ascii="Times New Roman" w:cs="Times New Roman" w:eastAsia="Times New Roman" w:hAnsi="Times New Roman"/>
@@ -9191,30 +9468,14 @@
           <w:szCs w:val="24"/>
           <w:rtl w:val="0"/>
         </w:rPr>
-        <w:t xml:space="preserve">Протягом епіку я навчився базі роботи з Git, GitHub, консольними командами Linux та здобув базові навички роботи з С++. Це дозволить перейти до глибшого вивчення і до створення більш масштабних </w:t>
-      </w:r>
-      <w:r>
-        <w:rPr>
-          <w:rFonts w:ascii="Times New Roman" w:cs="Times New Roman" w:eastAsia="Times New Roman" w:hAnsi="Times New Roman"/>
-          <w:sz w:val="24"/>
-          <w:szCs w:val="24"/>
-          <w:rtl w:val="0"/>
-        </w:rPr>
-        <w:t xml:space="preserve">проєктів</w:t>
-      </w:r>
-      <w:r>
-        <w:rPr>
-          <w:rFonts w:ascii="Times New Roman" w:cs="Times New Roman" w:eastAsia="Times New Roman" w:hAnsi="Times New Roman"/>
-          <w:sz w:val="24"/>
-          <w:szCs w:val="24"/>
-          <w:rtl w:val="0"/>
-        </w:rPr>
-        <w:t xml:space="preserve"> в майбутньому.</w:t>
-      </w:r>
-    </w:p>
-    <w:p>
-      <w:pPr>
-        <w:spacing w:after="240" w:before="240" w:line="276" w:lineRule="auto"/>
+        <w:br w:type="textWrapping"/>
+        <w:t xml:space="preserve">Протягом епіку я здобув гарний фундамент для роботи з кодом - Git, GitHub, консольні команди Linux, флоучарти, Trello, WSL. </w:t>
+      </w:r>
+    </w:p>
+    <w:p>
+      <w:pPr>
+        <w:spacing w:after="240" w:line="276" w:lineRule="auto"/>
+        <w:ind w:left="720" w:firstLine="0"/>
         <w:jc w:val="both"/>
         <w:rPr>
           <w:rFonts w:ascii="Times New Roman" w:cs="Times New Roman" w:eastAsia="Times New Roman" w:hAnsi="Times New Roman"/>
@@ -9229,17 +9490,17 @@
           <w:szCs w:val="24"/>
           <w:rtl w:val="0"/>
         </w:rPr>
-        <w:t xml:space="preserve">Здобуті навички:</w:t>
-      </w:r>
-    </w:p>
-    <w:p>
-      <w:pPr>
-        <w:numPr>
-          <w:ilvl w:val="0"/>
-          <w:numId w:val="7"/>
-        </w:numPr>
-        <w:spacing w:before="240" w:line="276" w:lineRule="auto"/>
-        <w:ind w:left="720" w:hanging="360"/>
+        <w:br w:type="textWrapping"/>
+        <w:t xml:space="preserve">Робота з Trello і флоучартами відкрила очі на якісне планування - це дуже пришвидшує роботу в команді та власне розуміння проблеми через графічне її зображення. Також графічне планування допомагає розвинути алгоритмічне мислення. </w:t>
+        <w:br w:type="textWrapping"/>
+        <w:br w:type="textWrapping"/>
+        <w:t xml:space="preserve">До початку епіку я не знав синтаксису С++ і не мав жодної уяви про Git і те, як з ним працювати. Наразі я можу написати хоч і простий, але робочий код, маю уявлення про компілятор, дебаггер та VS Code. </w:t>
+      </w:r>
+    </w:p>
+    <w:p>
+      <w:pPr>
+        <w:spacing w:after="240" w:line="276" w:lineRule="auto"/>
+        <w:ind w:left="720" w:firstLine="0"/>
         <w:jc w:val="both"/>
         <w:rPr>
           <w:rFonts w:ascii="Times New Roman" w:cs="Times New Roman" w:eastAsia="Times New Roman" w:hAnsi="Times New Roman"/>
@@ -9250,310 +9511,11 @@
       <w:r>
         <w:rPr>
           <w:rFonts w:ascii="Times New Roman" w:cs="Times New Roman" w:eastAsia="Times New Roman" w:hAnsi="Times New Roman"/>
-          <w:b w:val="1"/>
-          <w:bCs w:val="1"/>
-          <w:sz w:val="24"/>
-          <w:szCs w:val="24"/>
-          <w:rtl w:val="0"/>
-        </w:rPr>
-        <w:t xml:space="preserve">Робота в консолі Linux: </w:t>
-      </w:r>
-      <w:r>
-        <w:rPr>
-          <w:rFonts w:ascii="Times New Roman" w:cs="Times New Roman" w:eastAsia="Times New Roman" w:hAnsi="Times New Roman"/>
-          <w:sz w:val="24"/>
-          <w:szCs w:val="24"/>
-          <w:rtl w:val="0"/>
-        </w:rPr>
-        <w:t xml:space="preserve">Ознайомився з командами терміналу Linux.</w:t>
-      </w:r>
-    </w:p>
-    <w:p>
-      <w:pPr>
-        <w:numPr>
-          <w:ilvl w:val="0"/>
-          <w:numId w:val="7"/>
-        </w:numPr>
-        <w:spacing w:line="276" w:lineRule="auto"/>
-        <w:ind w:left="720" w:hanging="360"/>
-        <w:jc w:val="both"/>
-        <w:rPr>
-          <w:rFonts w:ascii="Times New Roman" w:cs="Times New Roman" w:eastAsia="Times New Roman" w:hAnsi="Times New Roman"/>
-          <w:sz w:val="24"/>
-          <w:szCs w:val="24"/>
-        </w:rPr>
-      </w:pPr>
-      <w:r>
-        <w:rPr>
-          <w:rFonts w:ascii="Times New Roman" w:cs="Times New Roman" w:eastAsia="Times New Roman" w:hAnsi="Times New Roman"/>
-          <w:b w:val="1"/>
-          <w:bCs w:val="1"/>
-          <w:sz w:val="24"/>
-          <w:szCs w:val="24"/>
-          <w:rtl w:val="0"/>
-        </w:rPr>
-        <w:t xml:space="preserve">Середовище розробки: </w:t>
-      </w:r>
-      <w:r>
-        <w:rPr>
-          <w:rFonts w:ascii="Times New Roman" w:cs="Times New Roman" w:eastAsia="Times New Roman" w:hAnsi="Times New Roman"/>
-          <w:sz w:val="24"/>
-          <w:szCs w:val="24"/>
-          <w:rtl w:val="0"/>
-        </w:rPr>
-        <w:t xml:space="preserve">Встановив та налаштував Visual Studio Code, дебаггер, компілятор. Встановив всі необхідні розширення для роботи з C++.</w:t>
-      </w:r>
-    </w:p>
-    <w:p>
-      <w:pPr>
-        <w:numPr>
-          <w:ilvl w:val="0"/>
-          <w:numId w:val="7"/>
-        </w:numPr>
-        <w:spacing w:line="276" w:lineRule="auto"/>
-        <w:ind w:left="720" w:hanging="360"/>
-        <w:jc w:val="both"/>
-        <w:rPr>
-          <w:rFonts w:ascii="Times New Roman" w:cs="Times New Roman" w:eastAsia="Times New Roman" w:hAnsi="Times New Roman"/>
-          <w:sz w:val="24"/>
-          <w:szCs w:val="24"/>
-        </w:rPr>
-      </w:pPr>
-      <w:r>
-        <w:rPr>
-          <w:rFonts w:ascii="Times New Roman" w:cs="Times New Roman" w:eastAsia="Times New Roman" w:hAnsi="Times New Roman"/>
-          <w:b w:val="1"/>
-          <w:bCs w:val="1"/>
-          <w:sz w:val="24"/>
-          <w:szCs w:val="24"/>
-          <w:rtl w:val="0"/>
-        </w:rPr>
-        <w:t xml:space="preserve">Контроль версій Git: </w:t>
-      </w:r>
-      <w:r>
-        <w:rPr>
-          <w:rFonts w:ascii="Times New Roman" w:cs="Times New Roman" w:eastAsia="Times New Roman" w:hAnsi="Times New Roman"/>
-          <w:sz w:val="24"/>
-          <w:szCs w:val="24"/>
-          <w:rtl w:val="0"/>
-        </w:rPr>
-        <w:t xml:space="preserve">Отримав навички роботи з Git. Зроблено перший коміт, оформлено пулл реквест. Створив акаунт та доєднався до репозиторію потоку та команди.</w:t>
-      </w:r>
-    </w:p>
-    <w:p>
-      <w:pPr>
-        <w:numPr>
-          <w:ilvl w:val="0"/>
-          <w:numId w:val="7"/>
-        </w:numPr>
-        <w:spacing w:line="276" w:lineRule="auto"/>
-        <w:ind w:left="720" w:hanging="360"/>
-        <w:jc w:val="both"/>
-        <w:rPr>
-          <w:rFonts w:ascii="Times New Roman" w:cs="Times New Roman" w:eastAsia="Times New Roman" w:hAnsi="Times New Roman"/>
-          <w:sz w:val="24"/>
-          <w:szCs w:val="24"/>
-        </w:rPr>
-      </w:pPr>
-      <w:r>
-        <w:rPr>
-          <w:rFonts w:ascii="Times New Roman" w:cs="Times New Roman" w:eastAsia="Times New Roman" w:hAnsi="Times New Roman"/>
-          <w:b w:val="1"/>
-          <w:bCs w:val="1"/>
-          <w:sz w:val="24"/>
-          <w:szCs w:val="24"/>
-          <w:rtl w:val="0"/>
-        </w:rPr>
-        <w:t xml:space="preserve">Організація проектів: </w:t>
-      </w:r>
-      <w:r>
-        <w:rPr>
-          <w:rFonts w:ascii="Times New Roman" w:cs="Times New Roman" w:eastAsia="Times New Roman" w:hAnsi="Times New Roman"/>
-          <w:sz w:val="24"/>
-          <w:szCs w:val="24"/>
-          <w:rtl w:val="0"/>
-        </w:rPr>
-        <w:t xml:space="preserve">Зареєструвався на Trello. Створив дошку та редагував її відповідно до етапів реалізації </w:t>
-      </w:r>
-      <w:r>
-        <w:rPr>
-          <w:rFonts w:ascii="Times New Roman" w:cs="Times New Roman" w:eastAsia="Times New Roman" w:hAnsi="Times New Roman"/>
-          <w:sz w:val="24"/>
-          <w:szCs w:val="24"/>
-          <w:rtl w:val="0"/>
-        </w:rPr>
-        <w:t xml:space="preserve">проєкту</w:t>
-      </w:r>
-      <w:r>
-        <w:rPr>
-          <w:rFonts w:ascii="Times New Roman" w:cs="Times New Roman" w:eastAsia="Times New Roman" w:hAnsi="Times New Roman"/>
-          <w:sz w:val="24"/>
-          <w:szCs w:val="24"/>
-          <w:rtl w:val="0"/>
-        </w:rPr>
-        <w:t xml:space="preserve">.</w:t>
-      </w:r>
-    </w:p>
-    <w:p>
-      <w:pPr>
-        <w:numPr>
-          <w:ilvl w:val="0"/>
-          <w:numId w:val="7"/>
-        </w:numPr>
-        <w:spacing w:line="276" w:lineRule="auto"/>
-        <w:ind w:left="720" w:hanging="360"/>
-        <w:jc w:val="both"/>
-        <w:rPr>
-          <w:rFonts w:ascii="Times New Roman" w:cs="Times New Roman" w:eastAsia="Times New Roman" w:hAnsi="Times New Roman"/>
-          <w:sz w:val="24"/>
-          <w:szCs w:val="24"/>
-        </w:rPr>
-      </w:pPr>
-      <w:r>
-        <w:rPr>
-          <w:rFonts w:ascii="Times New Roman" w:cs="Times New Roman" w:eastAsia="Times New Roman" w:hAnsi="Times New Roman"/>
-          <w:b w:val="1"/>
-          <w:bCs w:val="1"/>
-          <w:sz w:val="24"/>
-          <w:szCs w:val="24"/>
-          <w:rtl w:val="0"/>
-        </w:rPr>
-        <w:t xml:space="preserve">Робота з алгоритмами: </w:t>
-      </w:r>
-      <w:r>
-        <w:rPr>
-          <w:rFonts w:ascii="Times New Roman" w:cs="Times New Roman" w:eastAsia="Times New Roman" w:hAnsi="Times New Roman"/>
-          <w:sz w:val="24"/>
-          <w:szCs w:val="24"/>
-          <w:rtl w:val="0"/>
-        </w:rPr>
-        <w:t xml:space="preserve">Зробив 4 задачі з Algotester. Завантажив на перевірку. Поглибив розуміння алгоритмічного програмування.</w:t>
-      </w:r>
-    </w:p>
-    <w:p>
-      <w:pPr>
-        <w:numPr>
-          <w:ilvl w:val="0"/>
-          <w:numId w:val="7"/>
-        </w:numPr>
-        <w:spacing w:line="276" w:lineRule="auto"/>
-        <w:ind w:left="720" w:hanging="360"/>
-        <w:jc w:val="both"/>
-        <w:rPr>
-          <w:rFonts w:ascii="Times New Roman" w:cs="Times New Roman" w:eastAsia="Times New Roman" w:hAnsi="Times New Roman"/>
-          <w:sz w:val="24"/>
-          <w:szCs w:val="24"/>
-        </w:rPr>
-      </w:pPr>
-      <w:r>
-        <w:rPr>
-          <w:rFonts w:ascii="Times New Roman" w:cs="Times New Roman" w:eastAsia="Times New Roman" w:hAnsi="Times New Roman"/>
-          <w:b w:val="1"/>
-          <w:bCs w:val="1"/>
-          <w:sz w:val="24"/>
-          <w:szCs w:val="24"/>
-          <w:rtl w:val="0"/>
-        </w:rPr>
-        <w:t xml:space="preserve">Візуалізація:</w:t>
-      </w:r>
-      <w:r>
-        <w:rPr>
-          <w:rFonts w:ascii="Times New Roman" w:cs="Times New Roman" w:eastAsia="Times New Roman" w:hAnsi="Times New Roman"/>
-          <w:sz w:val="24"/>
-          <w:szCs w:val="24"/>
-          <w:rtl w:val="0"/>
-        </w:rPr>
-        <w:t xml:space="preserve"> Створив flowchart на сайті </w:t>
-      </w:r>
-      <w:r>
-        <w:rPr>
-          <w:rFonts w:ascii="Times New Roman" w:cs="Times New Roman" w:eastAsia="Times New Roman" w:hAnsi="Times New Roman"/>
-          <w:sz w:val="24"/>
-          <w:szCs w:val="24"/>
-          <w:rtl w:val="0"/>
-        </w:rPr>
-        <w:t xml:space="preserve">Draw.io</w:t>
-      </w:r>
-      <w:r>
-        <w:rPr>
-          <w:rFonts w:ascii="Times New Roman" w:cs="Times New Roman" w:eastAsia="Times New Roman" w:hAnsi="Times New Roman"/>
-          <w:sz w:val="24"/>
-          <w:szCs w:val="24"/>
-          <w:rtl w:val="0"/>
-        </w:rPr>
-        <w:t xml:space="preserve">, здобув базові навички роботи з візуальним плануванням.</w:t>
-      </w:r>
-    </w:p>
-    <w:p>
-      <w:pPr>
-        <w:numPr>
-          <w:ilvl w:val="0"/>
-          <w:numId w:val="7"/>
-        </w:numPr>
-        <w:spacing w:line="276" w:lineRule="auto"/>
-        <w:ind w:left="720" w:hanging="360"/>
-        <w:jc w:val="both"/>
-        <w:rPr>
-          <w:rFonts w:ascii="Times New Roman" w:cs="Times New Roman" w:eastAsia="Times New Roman" w:hAnsi="Times New Roman"/>
-          <w:sz w:val="24"/>
-          <w:szCs w:val="24"/>
-        </w:rPr>
-      </w:pPr>
-      <w:r>
-        <w:rPr>
-          <w:rFonts w:ascii="Times New Roman" w:cs="Times New Roman" w:eastAsia="Times New Roman" w:hAnsi="Times New Roman"/>
-          <w:b w:val="1"/>
-          <w:bCs w:val="1"/>
-          <w:sz w:val="24"/>
-          <w:szCs w:val="24"/>
-          <w:rtl w:val="0"/>
-        </w:rPr>
-        <w:t xml:space="preserve">Мова C++: </w:t>
-      </w:r>
-      <w:r>
-        <w:rPr>
-          <w:rFonts w:ascii="Times New Roman" w:cs="Times New Roman" w:eastAsia="Times New Roman" w:hAnsi="Times New Roman"/>
-          <w:sz w:val="24"/>
-          <w:szCs w:val="24"/>
-          <w:rtl w:val="0"/>
-        </w:rPr>
-        <w:t xml:space="preserve">Отримав базові знання про мову C++. Ознайомився з командами вводу - виводу, базовими бібліотеками, компілятором.</w:t>
-      </w:r>
-    </w:p>
-    <w:p>
-      <w:pPr>
-        <w:numPr>
-          <w:ilvl w:val="0"/>
-          <w:numId w:val="7"/>
-        </w:numPr>
-        <w:spacing w:after="240" w:line="276" w:lineRule="auto"/>
-        <w:ind w:left="720" w:hanging="360"/>
-        <w:jc w:val="both"/>
-        <w:rPr>
-          <w:rFonts w:ascii="Times New Roman" w:cs="Times New Roman" w:eastAsia="Times New Roman" w:hAnsi="Times New Roman"/>
-          <w:sz w:val="24"/>
-          <w:szCs w:val="24"/>
-        </w:rPr>
-      </w:pPr>
-      <w:r>
-        <w:rPr>
-          <w:rFonts w:ascii="Times New Roman" w:cs="Times New Roman" w:eastAsia="Times New Roman" w:hAnsi="Times New Roman"/>
-          <w:b w:val="1"/>
-          <w:bCs w:val="1"/>
-          <w:sz w:val="24"/>
-          <w:szCs w:val="24"/>
-          <w:rtl w:val="0"/>
-        </w:rPr>
-        <w:t xml:space="preserve">Робота у Google Docs: </w:t>
-      </w:r>
-      <w:r>
-        <w:rPr>
-          <w:rFonts w:ascii="Times New Roman" w:cs="Times New Roman" w:eastAsia="Times New Roman" w:hAnsi="Times New Roman"/>
-          <w:sz w:val="24"/>
-          <w:szCs w:val="24"/>
-          <w:rtl w:val="0"/>
-        </w:rPr>
-        <w:t xml:space="preserve">Створив звіт про виконану роботу.</w:t>
+          <w:sz w:val="24"/>
+          <w:szCs w:val="24"/>
+          <w:rtl w:val="0"/>
+        </w:rPr>
+        <w:t xml:space="preserve">З здобутими знаннями я почуваюся набагато впевненіше у навчанні та тепер маю чітке уявлення про те, як можна розвиватися і вчитися програмуванню правильно. </w:t>
       </w:r>
       <w:r>
         <w:rPr>
@@ -9562,7 +9524,7 @@
       </w:r>
     </w:p>
     <w:sectPr>
-      <w:footerReference r:id="rId60" w:type="default"/>
+      <w:footerReference r:id="rId46" w:type="default"/>
       <w:type w:val="nextPage"/>
       <w:pgSz w:h="16834" w:w="11909" w:orient="portrait"/>
       <w:pgMar w:bottom="1440" w:top="1440" w:left="1440" w:right="1440" w:header="720" w:footer="720"/>
@@ -10282,9 +10244,9 @@
   </w:abstractNum>
   <w:abstractNum w:abstractNumId="7">
     <w:lvl w:ilvl="0">
-      <w:start w:val="1"/>
+      <w:start w:val="0"/>
       <w:numFmt w:val="bullet"/>
-      <w:lvlText w:val="●"/>
+      <w:lvlText w:val="-"/>
       <w:lvlJc w:val="left"/>
       <w:pPr>
         <w:ind w:left="720" w:hanging="360"/>
@@ -10296,7 +10258,7 @@
     <w:lvl w:ilvl="1">
       <w:start w:val="1"/>
       <w:numFmt w:val="bullet"/>
-      <w:lvlText w:val="○"/>
+      <w:lvlText w:val="o"/>
       <w:lvlJc w:val="left"/>
       <w:pPr>
         <w:ind w:left="1440" w:hanging="360"/>
@@ -10308,7 +10270,7 @@
     <w:lvl w:ilvl="2">
       <w:start w:val="1"/>
       <w:numFmt w:val="bullet"/>
-      <w:lvlText w:val="■"/>
+      <w:lvlText w:val="▪"/>
       <w:lvlJc w:val="left"/>
       <w:pPr>
         <w:ind w:left="2160" w:hanging="360"/>
@@ -10332,7 +10294,7 @@
     <w:lvl w:ilvl="4">
       <w:start w:val="1"/>
       <w:numFmt w:val="bullet"/>
-      <w:lvlText w:val="○"/>
+      <w:lvlText w:val="o"/>
       <w:lvlJc w:val="left"/>
       <w:pPr>
         <w:ind w:left="3600" w:hanging="360"/>
@@ -10344,7 +10306,7 @@
     <w:lvl w:ilvl="5">
       <w:start w:val="1"/>
       <w:numFmt w:val="bullet"/>
-      <w:lvlText w:val="■"/>
+      <w:lvlText w:val="▪"/>
       <w:lvlJc w:val="left"/>
       <w:pPr>
         <w:ind w:left="4320" w:hanging="360"/>
@@ -10368,7 +10330,7 @@
     <w:lvl w:ilvl="7">
       <w:start w:val="1"/>
       <w:numFmt w:val="bullet"/>
-      <w:lvlText w:val="○"/>
+      <w:lvlText w:val="o"/>
       <w:lvlJc w:val="left"/>
       <w:pPr>
         <w:ind w:left="5760" w:hanging="360"/>
@@ -10380,7 +10342,7 @@
     <w:lvl w:ilvl="8">
       <w:start w:val="1"/>
       <w:numFmt w:val="bullet"/>
-      <w:lvlText w:val="■"/>
+      <w:lvlText w:val="▪"/>
       <w:lvlJc w:val="left"/>
       <w:pPr>
         <w:ind w:left="6480" w:hanging="360"/>
@@ -10502,7 +10464,7 @@
   </w:abstractNum>
   <w:abstractNum w:abstractNumId="9">
     <w:lvl w:ilvl="0">
-      <w:start w:val="0"/>
+      <w:start w:val="1"/>
       <w:numFmt w:val="bullet"/>
       <w:lvlText w:val="-"/>
       <w:lvlJc w:val="left"/>
@@ -10613,6 +10575,116 @@
   <w:abstractNum w:abstractNumId="10">
     <w:lvl w:ilvl="0">
       <w:start w:val="1"/>
+      <w:numFmt w:val="decimal"/>
+      <w:lvlText w:val="%1)"/>
+      <w:lvlJc w:val="left"/>
+      <w:pPr>
+        <w:ind w:left="720" w:hanging="360"/>
+      </w:pPr>
+      <w:rPr>
+        <w:u w:val="none"/>
+      </w:rPr>
+    </w:lvl>
+    <w:lvl w:ilvl="1">
+      <w:start w:val="1"/>
+      <w:numFmt w:val="lowerLetter"/>
+      <w:lvlText w:val="%2)"/>
+      <w:lvlJc w:val="left"/>
+      <w:pPr>
+        <w:ind w:left="1440" w:hanging="360"/>
+      </w:pPr>
+      <w:rPr>
+        <w:u w:val="none"/>
+      </w:rPr>
+    </w:lvl>
+    <w:lvl w:ilvl="2">
+      <w:start w:val="1"/>
+      <w:numFmt w:val="lowerRoman"/>
+      <w:lvlText w:val="%3)"/>
+      <w:lvlJc w:val="right"/>
+      <w:pPr>
+        <w:ind w:left="2160" w:hanging="360"/>
+      </w:pPr>
+      <w:rPr>
+        <w:u w:val="none"/>
+      </w:rPr>
+    </w:lvl>
+    <w:lvl w:ilvl="3">
+      <w:start w:val="1"/>
+      <w:numFmt w:val="decimal"/>
+      <w:lvlText w:val="(%4)"/>
+      <w:lvlJc w:val="left"/>
+      <w:pPr>
+        <w:ind w:left="2880" w:hanging="360"/>
+      </w:pPr>
+      <w:rPr>
+        <w:u w:val="none"/>
+      </w:rPr>
+    </w:lvl>
+    <w:lvl w:ilvl="4">
+      <w:start w:val="1"/>
+      <w:numFmt w:val="lowerLetter"/>
+      <w:lvlText w:val="(%5)"/>
+      <w:lvlJc w:val="left"/>
+      <w:pPr>
+        <w:ind w:left="3600" w:hanging="360"/>
+      </w:pPr>
+      <w:rPr>
+        <w:u w:val="none"/>
+      </w:rPr>
+    </w:lvl>
+    <w:lvl w:ilvl="5">
+      <w:start w:val="1"/>
+      <w:numFmt w:val="lowerRoman"/>
+      <w:lvlText w:val="(%6)"/>
+      <w:lvlJc w:val="right"/>
+      <w:pPr>
+        <w:ind w:left="4320" w:hanging="360"/>
+      </w:pPr>
+      <w:rPr>
+        <w:u w:val="none"/>
+      </w:rPr>
+    </w:lvl>
+    <w:lvl w:ilvl="6">
+      <w:start w:val="1"/>
+      <w:numFmt w:val="decimal"/>
+      <w:lvlText w:val="%7."/>
+      <w:lvlJc w:val="left"/>
+      <w:pPr>
+        <w:ind w:left="5040" w:hanging="360"/>
+      </w:pPr>
+      <w:rPr>
+        <w:u w:val="none"/>
+      </w:rPr>
+    </w:lvl>
+    <w:lvl w:ilvl="7">
+      <w:start w:val="1"/>
+      <w:numFmt w:val="lowerLetter"/>
+      <w:lvlText w:val="%8."/>
+      <w:lvlJc w:val="left"/>
+      <w:pPr>
+        <w:ind w:left="5760" w:hanging="360"/>
+      </w:pPr>
+      <w:rPr>
+        <w:u w:val="none"/>
+      </w:rPr>
+    </w:lvl>
+    <w:lvl w:ilvl="8">
+      <w:start w:val="1"/>
+      <w:numFmt w:val="lowerRoman"/>
+      <w:lvlText w:val="%9."/>
+      <w:lvlJc w:val="right"/>
+      <w:pPr>
+        <w:ind w:left="6480" w:hanging="360"/>
+      </w:pPr>
+      <w:rPr>
+        <w:u w:val="none"/>
+      </w:rPr>
+    </w:lvl>
+  </w:abstractNum>
+  <w:abstractNum w:abstractNumId="11">
+    <w:lvl w:ilvl="0">
+      <w:start w:val="1"/>
       <w:numFmt w:val="bullet"/>
       <w:lvlText w:val="-"/>
       <w:lvlJc w:val="left"/>
@@ -10712,116 +10784,6 @@
       <w:numFmt w:val="bullet"/>
       <w:lvlText w:val="▪"/>
       <w:lvlJc w:val="left"/>
-      <w:pPr>
-        <w:ind w:left="6480" w:hanging="360"/>
-      </w:pPr>
-      <w:rPr>
-        <w:u w:val="none"/>
-      </w:rPr>
-    </w:lvl>
-  </w:abstractNum>
-  <w:abstractNum w:abstractNumId="11">
-    <w:lvl w:ilvl="0">
-      <w:start w:val="1"/>
-      <w:numFmt w:val="decimal"/>
-      <w:lvlText w:val="%1)"/>
-      <w:lvlJc w:val="left"/>
-      <w:pPr>
-        <w:ind w:left="720" w:hanging="360"/>
-      </w:pPr>
-      <w:rPr>
-        <w:u w:val="none"/>
-      </w:rPr>
-    </w:lvl>
-    <w:lvl w:ilvl="1">
-      <w:start w:val="1"/>
-      <w:numFmt w:val="lowerLetter"/>
-      <w:lvlText w:val="%2)"/>
-      <w:lvlJc w:val="left"/>
-      <w:pPr>
-        <w:ind w:left="1440" w:hanging="360"/>
-      </w:pPr>
-      <w:rPr>
-        <w:u w:val="none"/>
-      </w:rPr>
-    </w:lvl>
-    <w:lvl w:ilvl="2">
-      <w:start w:val="1"/>
-      <w:numFmt w:val="lowerRoman"/>
-      <w:lvlText w:val="%3)"/>
-      <w:lvlJc w:val="right"/>
-      <w:pPr>
-        <w:ind w:left="2160" w:hanging="360"/>
-      </w:pPr>
-      <w:rPr>
-        <w:u w:val="none"/>
-      </w:rPr>
-    </w:lvl>
-    <w:lvl w:ilvl="3">
-      <w:start w:val="1"/>
-      <w:numFmt w:val="decimal"/>
-      <w:lvlText w:val="(%4)"/>
-      <w:lvlJc w:val="left"/>
-      <w:pPr>
-        <w:ind w:left="2880" w:hanging="360"/>
-      </w:pPr>
-      <w:rPr>
-        <w:u w:val="none"/>
-      </w:rPr>
-    </w:lvl>
-    <w:lvl w:ilvl="4">
-      <w:start w:val="1"/>
-      <w:numFmt w:val="lowerLetter"/>
-      <w:lvlText w:val="(%5)"/>
-      <w:lvlJc w:val="left"/>
-      <w:pPr>
-        <w:ind w:left="3600" w:hanging="360"/>
-      </w:pPr>
-      <w:rPr>
-        <w:u w:val="none"/>
-      </w:rPr>
-    </w:lvl>
-    <w:lvl w:ilvl="5">
-      <w:start w:val="1"/>
-      <w:numFmt w:val="lowerRoman"/>
-      <w:lvlText w:val="(%6)"/>
-      <w:lvlJc w:val="right"/>
-      <w:pPr>
-        <w:ind w:left="4320" w:hanging="360"/>
-      </w:pPr>
-      <w:rPr>
-        <w:u w:val="none"/>
-      </w:rPr>
-    </w:lvl>
-    <w:lvl w:ilvl="6">
-      <w:start w:val="1"/>
-      <w:numFmt w:val="decimal"/>
-      <w:lvlText w:val="%7."/>
-      <w:lvlJc w:val="left"/>
-      <w:pPr>
-        <w:ind w:left="5040" w:hanging="360"/>
-      </w:pPr>
-      <w:rPr>
-        <w:u w:val="none"/>
-      </w:rPr>
-    </w:lvl>
-    <w:lvl w:ilvl="7">
-      <w:start w:val="1"/>
-      <w:numFmt w:val="lowerLetter"/>
-      <w:lvlText w:val="%8."/>
-      <w:lvlJc w:val="left"/>
-      <w:pPr>
-        <w:ind w:left="5760" w:hanging="360"/>
-      </w:pPr>
-      <w:rPr>
-        <w:u w:val="none"/>
-      </w:rPr>
-    </w:lvl>
-    <w:lvl w:ilvl="8">
-      <w:start w:val="1"/>
-      <w:numFmt w:val="lowerRoman"/>
-      <w:lvlText w:val="%9."/>
-      <w:lvlJc w:val="right"/>
       <w:pPr>
         <w:ind w:left="6480" w:hanging="360"/>
       </w:pPr>
@@ -10846,116 +10808,6 @@
     <w:lvl w:ilvl="1">
       <w:start w:val="1"/>
       <w:numFmt w:val="bullet"/>
-      <w:lvlText w:val="o"/>
-      <w:lvlJc w:val="left"/>
-      <w:pPr>
-        <w:ind w:left="1440" w:hanging="360"/>
-      </w:pPr>
-      <w:rPr>
-        <w:u w:val="none"/>
-      </w:rPr>
-    </w:lvl>
-    <w:lvl w:ilvl="2">
-      <w:start w:val="1"/>
-      <w:numFmt w:val="bullet"/>
-      <w:lvlText w:val="▪"/>
-      <w:lvlJc w:val="left"/>
-      <w:pPr>
-        <w:ind w:left="2160" w:hanging="360"/>
-      </w:pPr>
-      <w:rPr>
-        <w:u w:val="none"/>
-      </w:rPr>
-    </w:lvl>
-    <w:lvl w:ilvl="3">
-      <w:start w:val="1"/>
-      <w:numFmt w:val="bullet"/>
-      <w:lvlText w:val="●"/>
-      <w:lvlJc w:val="left"/>
-      <w:pPr>
-        <w:ind w:left="2880" w:hanging="360"/>
-      </w:pPr>
-      <w:rPr>
-        <w:u w:val="none"/>
-      </w:rPr>
-    </w:lvl>
-    <w:lvl w:ilvl="4">
-      <w:start w:val="1"/>
-      <w:numFmt w:val="bullet"/>
-      <w:lvlText w:val="o"/>
-      <w:lvlJc w:val="left"/>
-      <w:pPr>
-        <w:ind w:left="3600" w:hanging="360"/>
-      </w:pPr>
-      <w:rPr>
-        <w:u w:val="none"/>
-      </w:rPr>
-    </w:lvl>
-    <w:lvl w:ilvl="5">
-      <w:start w:val="1"/>
-      <w:numFmt w:val="bullet"/>
-      <w:lvlText w:val="▪"/>
-      <w:lvlJc w:val="left"/>
-      <w:pPr>
-        <w:ind w:left="4320" w:hanging="360"/>
-      </w:pPr>
-      <w:rPr>
-        <w:u w:val="none"/>
-      </w:rPr>
-    </w:lvl>
-    <w:lvl w:ilvl="6">
-      <w:start w:val="1"/>
-      <w:numFmt w:val="bullet"/>
-      <w:lvlText w:val="●"/>
-      <w:lvlJc w:val="left"/>
-      <w:pPr>
-        <w:ind w:left="5040" w:hanging="360"/>
-      </w:pPr>
-      <w:rPr>
-        <w:u w:val="none"/>
-      </w:rPr>
-    </w:lvl>
-    <w:lvl w:ilvl="7">
-      <w:start w:val="1"/>
-      <w:numFmt w:val="bullet"/>
-      <w:lvlText w:val="o"/>
-      <w:lvlJc w:val="left"/>
-      <w:pPr>
-        <w:ind w:left="5760" w:hanging="360"/>
-      </w:pPr>
-      <w:rPr>
-        <w:u w:val="none"/>
-      </w:rPr>
-    </w:lvl>
-    <w:lvl w:ilvl="8">
-      <w:start w:val="1"/>
-      <w:numFmt w:val="bullet"/>
-      <w:lvlText w:val="▪"/>
-      <w:lvlJc w:val="left"/>
-      <w:pPr>
-        <w:ind w:left="6480" w:hanging="360"/>
-      </w:pPr>
-      <w:rPr>
-        <w:u w:val="none"/>
-      </w:rPr>
-    </w:lvl>
-  </w:abstractNum>
-  <w:abstractNum w:abstractNumId="13">
-    <w:lvl w:ilvl="0">
-      <w:start w:val="1"/>
-      <w:numFmt w:val="bullet"/>
-      <w:lvlText w:val="-"/>
-      <w:lvlJc w:val="left"/>
-      <w:pPr>
-        <w:ind w:left="720" w:hanging="360"/>
-      </w:pPr>
-      <w:rPr>
-        <w:u w:val="none"/>
-      </w:rPr>
-    </w:lvl>
-    <w:lvl w:ilvl="1">
-      <w:start w:val="1"/>
-      <w:numFmt w:val="bullet"/>
       <w:lvlText w:val="-"/>
       <w:lvlJc w:val="left"/>
       <w:pPr>
@@ -11050,7 +10902,7 @@
       </w:rPr>
     </w:lvl>
   </w:abstractNum>
-  <w:abstractNum w:abstractNumId="14">
+  <w:abstractNum w:abstractNumId="13">
     <w:lvl w:ilvl="0">
       <w:start w:val="1"/>
       <w:numFmt w:val="bullet"/>
@@ -11198,9 +11050,6 @@
   </w:num>
   <w:num w:numId="13">
     <w:abstractNumId w:val="13"/>
-  </w:num>
-  <w:num w:numId="14">
-    <w:abstractNumId w:val="14"/>
   </w:num>
 </w:numbering>
 </file>

</xml_diff>

<commit_message>
Epic 1 - Aizenberh Pavlo
</commit_message>
<xml_diff>
--- a/ai_11/pavlo_aizenberh/epic_1/epic_1_report_pavlo_aizenberh.docx
+++ b/ai_11/pavlo_aizenberh/epic_1/epic_1_report_pavlo_aizenberh.docx
@@ -12,12 +12,12 @@
           <wp:inline distB="114300" distT="114300" distL="114300" distR="114300">
             <wp:extent cx="5731200" cy="4305300"/>
             <wp:effectExtent b="0" l="0" r="0" t="0"/>
-            <wp:docPr id="6" name="image17.png"/>
+            <wp:docPr id="3" name="image3.png"/>
             <a:graphic>
               <a:graphicData uri="http://schemas.openxmlformats.org/drawingml/2006/picture">
                 <pic:pic>
                   <pic:nvPicPr>
-                    <pic:cNvPr id="0" name="image17.png"/>
+                    <pic:cNvPr id="0" name="image3.png"/>
                     <pic:cNvPicPr preferRelativeResize="0"/>
                   </pic:nvPicPr>
                   <pic:blipFill>
@@ -300,7 +300,7 @@
           <w:szCs w:val="28"/>
           <w:rtl w:val="0"/>
         </w:rPr>
-        <w:t xml:space="preserve">Виконав(ла):</w:t>
+        <w:t xml:space="preserve">Виконав:</w:t>
       </w:r>
     </w:p>
     <w:p>
@@ -621,9 +621,45 @@
           <w:szCs w:val="24"/>
           <w:rtl w:val="0"/>
         </w:rPr>
-        <w:t xml:space="preserve">, Word та створенням звітів на практичні та лабораторні, Git та командами, GitHub pull-request’ами і review, Algotester, Trello. </w:t>
+        <w:t xml:space="preserve">, Word та створенням звітів на практичні та лабораторні, Git та командами, GitHub pull-</w:t>
+      </w:r>
+      <w:r>
+        <w:rPr>
+          <w:rFonts w:ascii="Calibri" w:cs="Calibri" w:eastAsia="Calibri" w:hAnsi="Calibri"/>
+          <w:sz w:val="24"/>
+          <w:szCs w:val="24"/>
+          <w:rtl w:val="0"/>
+        </w:rPr>
+        <w:t xml:space="preserve">request’ами</w:t>
+      </w:r>
+      <w:r>
+        <w:rPr>
+          <w:rFonts w:ascii="Calibri" w:cs="Calibri" w:eastAsia="Calibri" w:hAnsi="Calibri"/>
+          <w:sz w:val="24"/>
+          <w:szCs w:val="24"/>
+          <w:rtl w:val="0"/>
+        </w:rPr>
+        <w:t xml:space="preserve"> і review, Algotester, Trello. </w:t>
         <w:br w:type="textWrapping"/>
-        <w:t xml:space="preserve">Встановити на сконфігурувати Visual Studio Code,  розширення для C++ на систему та Visual Studio Code, Git. </w:t>
+        <w:t xml:space="preserve">Встановити на </w:t>
+      </w:r>
+      <w:r>
+        <w:rPr>
+          <w:rFonts w:ascii="Calibri" w:cs="Calibri" w:eastAsia="Calibri" w:hAnsi="Calibri"/>
+          <w:sz w:val="24"/>
+          <w:szCs w:val="24"/>
+          <w:rtl w:val="0"/>
+        </w:rPr>
+        <w:t xml:space="preserve">сконфігурувати</w:t>
+      </w:r>
+      <w:r>
+        <w:rPr>
+          <w:rFonts w:ascii="Calibri" w:cs="Calibri" w:eastAsia="Calibri" w:hAnsi="Calibri"/>
+          <w:sz w:val="24"/>
+          <w:szCs w:val="24"/>
+          <w:rtl w:val="0"/>
+        </w:rPr>
+        <w:t xml:space="preserve"> Visual Studio Code,  розширення для C++ на систему та Visual Studio Code, Git. </w:t>
         <w:br w:type="textWrapping"/>
         <w:t xml:space="preserve">Зареєструватися на GitHub, Algotester, Trello.</w:t>
       </w:r>
@@ -3914,22 +3950,6 @@
         <w:jc w:val="both"/>
         <w:rPr>
           <w:rFonts w:ascii="Times New Roman" w:cs="Times New Roman" w:eastAsia="Times New Roman" w:hAnsi="Times New Roman"/>
-          <w:sz w:val="24"/>
-          <w:szCs w:val="24"/>
-        </w:rPr>
-      </w:pPr>
-      <w:r>
-        <w:rPr>
-          <w:rtl w:val="0"/>
-        </w:rPr>
-      </w:r>
-    </w:p>
-    <w:p>
-      <w:pPr>
-        <w:spacing w:line="276" w:lineRule="auto"/>
-        <w:jc w:val="both"/>
-        <w:rPr>
-          <w:rFonts w:ascii="Times New Roman" w:cs="Times New Roman" w:eastAsia="Times New Roman" w:hAnsi="Times New Roman"/>
           <w:b w:val="1"/>
           <w:bCs w:val="1"/>
           <w:sz w:val="24"/>
@@ -4198,7 +4218,25 @@
           <w:szCs w:val="24"/>
           <w:rtl w:val="0"/>
         </w:rPr>
-        <w:t xml:space="preserve">Створити акаунт на GitHub. Створити репозиторій для збереження та ведення версій </w:t>
+        <w:t xml:space="preserve">Створити </w:t>
+      </w:r>
+      <w:r>
+        <w:rPr>
+          <w:rFonts w:ascii="Times New Roman" w:cs="Times New Roman" w:eastAsia="Times New Roman" w:hAnsi="Times New Roman"/>
+          <w:sz w:val="24"/>
+          <w:szCs w:val="24"/>
+          <w:rtl w:val="0"/>
+        </w:rPr>
+        <w:t xml:space="preserve">акаунт</w:t>
+      </w:r>
+      <w:r>
+        <w:rPr>
+          <w:rFonts w:ascii="Times New Roman" w:cs="Times New Roman" w:eastAsia="Times New Roman" w:hAnsi="Times New Roman"/>
+          <w:sz w:val="24"/>
+          <w:szCs w:val="24"/>
+          <w:rtl w:val="0"/>
+        </w:rPr>
+        <w:t xml:space="preserve"> на GitHub. Створити репозиторій для збереження та ведення версій </w:t>
       </w:r>
       <w:r>
         <w:rPr>
@@ -4741,7 +4779,7 @@
           <w:szCs w:val="24"/>
           <w:rtl w:val="0"/>
         </w:rPr>
-        <w:t xml:space="preserve">Завдання №14 Algotester task 0001</w:t>
+        <w:t xml:space="preserve">Завдання №14 Self practice Algotester task 0001</w:t>
       </w:r>
     </w:p>
     <w:p>
@@ -4807,7 +4845,7 @@
           <w:szCs w:val="24"/>
           <w:rtl w:val="0"/>
         </w:rPr>
-        <w:t xml:space="preserve">Завдання №15 Algotester task 0011</w:t>
+        <w:t xml:space="preserve">Завдання №15 Self practice Algotester task 0011</w:t>
       </w:r>
     </w:p>
     <w:p>
@@ -4873,7 +4911,7 @@
           <w:szCs w:val="24"/>
           <w:rtl w:val="0"/>
         </w:rPr>
-        <w:t xml:space="preserve">Завдання №16 Algotester task 0021</w:t>
+        <w:t xml:space="preserve">Завдання №16 Self practice Algotester task 0021</w:t>
       </w:r>
     </w:p>
     <w:p>
@@ -4939,7 +4977,7 @@
           <w:szCs w:val="24"/>
           <w:rtl w:val="0"/>
         </w:rPr>
-        <w:t xml:space="preserve">Завдання №17 Algotester task 0181</w:t>
+        <w:t xml:space="preserve">Завдання №17 Self practice Algotester task 0181</w:t>
       </w:r>
     </w:p>
     <w:p>
@@ -5147,12 +5185,12 @@
           <wp:inline distB="114300" distT="114300" distL="114300" distR="114300">
             <wp:extent cx="4000500" cy="6886575"/>
             <wp:effectExtent b="0" l="0" r="0" t="0"/>
-            <wp:docPr id="17" name="image3.png"/>
+            <wp:docPr id="27" name="image30.png"/>
             <a:graphic>
               <a:graphicData uri="http://schemas.openxmlformats.org/drawingml/2006/picture">
                 <pic:pic>
                   <pic:nvPicPr>
-                    <pic:cNvPr id="0" name="image3.png"/>
+                    <pic:cNvPr id="0" name="image30.png"/>
                     <pic:cNvPicPr preferRelativeResize="0"/>
                   </pic:nvPicPr>
                   <pic:blipFill>
@@ -5186,12 +5224,12 @@
           <wp:inline distB="114300" distT="114300" distL="114300" distR="114300">
             <wp:extent cx="4552950" cy="6381750"/>
             <wp:effectExtent b="0" l="0" r="0" t="0"/>
-            <wp:docPr id="10" name="image13.png"/>
+            <wp:docPr id="6" name="image26.png"/>
             <a:graphic>
               <a:graphicData uri="http://schemas.openxmlformats.org/drawingml/2006/picture">
                 <pic:pic>
                   <pic:nvPicPr>
-                    <pic:cNvPr id="0" name="image13.png"/>
+                    <pic:cNvPr id="0" name="image26.png"/>
                     <pic:cNvPicPr preferRelativeResize="0"/>
                   </pic:nvPicPr>
                   <pic:blipFill>
@@ -5225,12 +5263,12 @@
           <wp:inline distB="114300" distT="114300" distL="114300" distR="114300">
             <wp:extent cx="5731200" cy="6007100"/>
             <wp:effectExtent b="0" l="0" r="0" t="0"/>
-            <wp:docPr id="29" name="image21.png"/>
+            <wp:docPr id="33" name="image31.png"/>
             <a:graphic>
               <a:graphicData uri="http://schemas.openxmlformats.org/drawingml/2006/picture">
                 <pic:pic>
                   <pic:nvPicPr>
-                    <pic:cNvPr id="0" name="image21.png"/>
+                    <pic:cNvPr id="0" name="image31.png"/>
                     <pic:cNvPicPr preferRelativeResize="0"/>
                   </pic:nvPicPr>
                   <pic:blipFill>
@@ -5556,12 +5594,12 @@
           <wp:inline distB="114300" distT="114300" distL="114300" distR="114300">
             <wp:extent cx="5731200" cy="2844800"/>
             <wp:effectExtent b="0" l="0" r="0" t="0"/>
-            <wp:docPr id="3" name="image4.png"/>
+            <wp:docPr id="1" name="image12.png"/>
             <a:graphic>
               <a:graphicData uri="http://schemas.openxmlformats.org/drawingml/2006/picture">
                 <pic:pic>
                   <pic:nvPicPr>
-                    <pic:cNvPr id="0" name="image4.png"/>
+                    <pic:cNvPr id="0" name="image12.png"/>
                     <pic:cNvPicPr preferRelativeResize="0"/>
                   </pic:nvPicPr>
                   <pic:blipFill>
@@ -5797,12 +5835,12 @@
           <wp:inline distB="114300" distT="114300" distL="114300" distR="114300">
             <wp:extent cx="5731200" cy="2997200"/>
             <wp:effectExtent b="0" l="0" r="0" t="0"/>
-            <wp:docPr id="9" name="image18.png"/>
+            <wp:docPr id="5" name="image15.png"/>
             <a:graphic>
               <a:graphicData uri="http://schemas.openxmlformats.org/drawingml/2006/picture">
                 <pic:pic>
                   <pic:nvPicPr>
-                    <pic:cNvPr id="0" name="image18.png"/>
+                    <pic:cNvPr id="0" name="image15.png"/>
                     <pic:cNvPicPr preferRelativeResize="0"/>
                   </pic:nvPicPr>
                   <pic:blipFill>
@@ -6029,12 +6067,12 @@
           <wp:inline distB="114300" distT="114300" distL="114300" distR="114300">
             <wp:extent cx="5731200" cy="3073400"/>
             <wp:effectExtent b="0" l="0" r="0" t="0"/>
-            <wp:docPr id="5" name="image1.png"/>
+            <wp:docPr id="2" name="image4.png"/>
             <a:graphic>
               <a:graphicData uri="http://schemas.openxmlformats.org/drawingml/2006/picture">
                 <pic:pic>
                   <pic:nvPicPr>
-                    <pic:cNvPr id="0" name="image1.png"/>
+                    <pic:cNvPr id="0" name="image4.png"/>
                     <pic:cNvPicPr preferRelativeResize="0"/>
                   </pic:nvPicPr>
                   <pic:blipFill>
@@ -6233,12 +6271,12 @@
           <wp:inline distB="114300" distT="114300" distL="114300" distR="114300">
             <wp:extent cx="4348163" cy="5944832"/>
             <wp:effectExtent b="0" l="0" r="0" t="0"/>
-            <wp:docPr id="21" name="image27.png"/>
+            <wp:docPr id="28" name="image29.png"/>
             <a:graphic>
               <a:graphicData uri="http://schemas.openxmlformats.org/drawingml/2006/picture">
                 <pic:pic>
                   <pic:nvPicPr>
-                    <pic:cNvPr id="0" name="image27.png"/>
+                    <pic:cNvPr id="0" name="image29.png"/>
                     <pic:cNvPicPr preferRelativeResize="0"/>
                   </pic:nvPicPr>
                   <pic:blipFill>
@@ -6394,7 +6432,25 @@
           <w:szCs w:val="24"/>
           <w:rtl w:val="0"/>
         </w:rPr>
-        <w:t xml:space="preserve">Створив акаунт на GitHub</w:t>
+        <w:t xml:space="preserve">Створив </w:t>
+      </w:r>
+      <w:r>
+        <w:rPr>
+          <w:rFonts w:ascii="Times New Roman" w:cs="Times New Roman" w:eastAsia="Times New Roman" w:hAnsi="Times New Roman"/>
+          <w:sz w:val="24"/>
+          <w:szCs w:val="24"/>
+          <w:rtl w:val="0"/>
+        </w:rPr>
+        <w:t xml:space="preserve">акаунт</w:t>
+      </w:r>
+      <w:r>
+        <w:rPr>
+          <w:rFonts w:ascii="Times New Roman" w:cs="Times New Roman" w:eastAsia="Times New Roman" w:hAnsi="Times New Roman"/>
+          <w:sz w:val="24"/>
+          <w:szCs w:val="24"/>
+          <w:rtl w:val="0"/>
+        </w:rPr>
+        <w:t xml:space="preserve"> на GitHub</w:t>
       </w:r>
     </w:p>
     <w:p>
@@ -6488,12 +6544,12 @@
           <wp:inline distB="114300" distT="114300" distL="114300" distR="114300">
             <wp:extent cx="5731200" cy="3136900"/>
             <wp:effectExtent b="0" l="0" r="0" t="0"/>
-            <wp:docPr id="23" name="image26.png"/>
+            <wp:docPr id="13" name="image2.png"/>
             <a:graphic>
               <a:graphicData uri="http://schemas.openxmlformats.org/drawingml/2006/picture">
                 <pic:pic>
                   <pic:nvPicPr>
-                    <pic:cNvPr id="0" name="image26.png"/>
+                    <pic:cNvPr id="0" name="image2.png"/>
                     <pic:cNvPicPr preferRelativeResize="0"/>
                   </pic:nvPicPr>
                   <pic:blipFill>
@@ -6724,12 +6780,12 @@
           <wp:inline distB="114300" distT="114300" distL="114300" distR="114300">
             <wp:extent cx="5731200" cy="1460500"/>
             <wp:effectExtent b="0" l="0" r="0" t="0"/>
-            <wp:docPr id="28" name="image20.png"/>
+            <wp:docPr id="17" name="image25.png"/>
             <a:graphic>
               <a:graphicData uri="http://schemas.openxmlformats.org/drawingml/2006/picture">
                 <pic:pic>
                   <pic:nvPicPr>
-                    <pic:cNvPr id="0" name="image20.png"/>
+                    <pic:cNvPr id="0" name="image25.png"/>
                     <pic:cNvPicPr preferRelativeResize="0"/>
                   </pic:nvPicPr>
                   <pic:blipFill>
@@ -6815,12 +6871,12 @@
           <wp:inline distB="114300" distT="114300" distL="114300" distR="114300">
             <wp:extent cx="5731200" cy="1143000"/>
             <wp:effectExtent b="0" l="0" r="0" t="0"/>
-            <wp:docPr id="13" name="image7.png"/>
+            <wp:docPr id="7" name="image10.png"/>
             <a:graphic>
               <a:graphicData uri="http://schemas.openxmlformats.org/drawingml/2006/picture">
                 <pic:pic>
                   <pic:nvPicPr>
-                    <pic:cNvPr id="0" name="image7.png"/>
+                    <pic:cNvPr id="0" name="image10.png"/>
                     <pic:cNvPicPr preferRelativeResize="0"/>
                   </pic:nvPicPr>
                   <pic:blipFill>
@@ -6916,26 +6972,6 @@
     </w:p>
     <w:p>
       <w:pPr>
-        <w:spacing w:line="240" w:lineRule="auto"/>
-        <w:ind w:left="720" w:firstLine="0"/>
-        <w:jc w:val="center"/>
-        <w:rPr>
-          <w:rFonts w:ascii="Times New Roman" w:cs="Times New Roman" w:eastAsia="Times New Roman" w:hAnsi="Times New Roman"/>
-          <w:i w:val="1"/>
-          <w:iCs w:val="1"/>
-          <w:color w:val="3d85c6"/>
-          <w:sz w:val="20"/>
-          <w:szCs w:val="20"/>
-        </w:rPr>
-      </w:pPr>
-      <w:r>
-        <w:rPr>
-          <w:rtl w:val="0"/>
-        </w:rPr>
-      </w:r>
-    </w:p>
-    <w:p>
-      <w:pPr>
         <w:spacing w:line="276" w:lineRule="auto"/>
         <w:jc w:val="both"/>
         <w:rPr>
@@ -7035,12 +7071,12 @@
           <wp:inline distB="114300" distT="114300" distL="114300" distR="114300">
             <wp:extent cx="5731200" cy="4241800"/>
             <wp:effectExtent b="0" l="0" r="0" t="0"/>
-            <wp:docPr id="4" name="image8.png"/>
+            <wp:docPr id="22" name="image7.png"/>
             <a:graphic>
               <a:graphicData uri="http://schemas.openxmlformats.org/drawingml/2006/picture">
                 <pic:pic>
                   <pic:nvPicPr>
-                    <pic:cNvPr id="0" name="image8.png"/>
+                    <pic:cNvPr id="0" name="image7.png"/>
                     <pic:cNvPicPr preferRelativeResize="0"/>
                   </pic:nvPicPr>
                   <pic:blipFill>
@@ -7074,12 +7110,12 @@
           <wp:inline distB="114300" distT="114300" distL="114300" distR="114300">
             <wp:extent cx="5731200" cy="4051300"/>
             <wp:effectExtent b="0" l="0" r="0" t="0"/>
-            <wp:docPr id="15" name="image12.png"/>
+            <wp:docPr id="26" name="image28.png"/>
             <a:graphic>
               <a:graphicData uri="http://schemas.openxmlformats.org/drawingml/2006/picture">
                 <pic:pic>
                   <pic:nvPicPr>
-                    <pic:cNvPr id="0" name="image12.png"/>
+                    <pic:cNvPr id="0" name="image28.png"/>
                     <pic:cNvPicPr preferRelativeResize="0"/>
                   </pic:nvPicPr>
                   <pic:blipFill>
@@ -7113,12 +7149,12 @@
           <wp:inline distB="114300" distT="114300" distL="114300" distR="114300">
             <wp:extent cx="5731200" cy="4203700"/>
             <wp:effectExtent b="0" l="0" r="0" t="0"/>
-            <wp:docPr id="25" name="image22.png"/>
+            <wp:docPr id="15" name="image19.png"/>
             <a:graphic>
               <a:graphicData uri="http://schemas.openxmlformats.org/drawingml/2006/picture">
                 <pic:pic>
                   <pic:nvPicPr>
-                    <pic:cNvPr id="0" name="image22.png"/>
+                    <pic:cNvPr id="0" name="image19.png"/>
                     <pic:cNvPicPr preferRelativeResize="0"/>
                   </pic:nvPicPr>
                   <pic:blipFill>
@@ -7152,12 +7188,12 @@
           <wp:inline distB="114300" distT="114300" distL="114300" distR="114300">
             <wp:extent cx="5731200" cy="3949700"/>
             <wp:effectExtent b="0" l="0" r="0" t="0"/>
-            <wp:docPr id="19" name="image11.png"/>
+            <wp:docPr id="11" name="image24.png"/>
             <a:graphic>
               <a:graphicData uri="http://schemas.openxmlformats.org/drawingml/2006/picture">
                 <pic:pic>
                   <pic:nvPicPr>
-                    <pic:cNvPr id="0" name="image11.png"/>
+                    <pic:cNvPr id="0" name="image24.png"/>
                     <pic:cNvPicPr preferRelativeResize="0"/>
                   </pic:nvPicPr>
                   <pic:blipFill>
@@ -7191,12 +7227,12 @@
           <wp:inline distB="114300" distT="114300" distL="114300" distR="114300">
             <wp:extent cx="5731200" cy="3848100"/>
             <wp:effectExtent b="0" l="0" r="0" t="0"/>
-            <wp:docPr id="22" name="image25.png"/>
+            <wp:docPr id="29" name="image21.png"/>
             <a:graphic>
               <a:graphicData uri="http://schemas.openxmlformats.org/drawingml/2006/picture">
                 <pic:pic>
                   <pic:nvPicPr>
-                    <pic:cNvPr id="0" name="image25.png"/>
+                    <pic:cNvPr id="0" name="image21.png"/>
                     <pic:cNvPicPr preferRelativeResize="0"/>
                   </pic:nvPicPr>
                   <pic:blipFill>
@@ -7230,12 +7266,12 @@
           <wp:inline distB="114300" distT="114300" distL="114300" distR="114300">
             <wp:extent cx="5731200" cy="3416300"/>
             <wp:effectExtent b="0" l="0" r="0" t="0"/>
-            <wp:docPr id="11" name="image9.png"/>
+            <wp:docPr id="24" name="image27.png"/>
             <a:graphic>
               <a:graphicData uri="http://schemas.openxmlformats.org/drawingml/2006/picture">
                 <pic:pic>
                   <pic:nvPicPr>
-                    <pic:cNvPr id="0" name="image9.png"/>
+                    <pic:cNvPr id="0" name="image27.png"/>
                     <pic:cNvPicPr preferRelativeResize="0"/>
                   </pic:nvPicPr>
                   <pic:blipFill>
@@ -7468,12 +7504,12 @@
           <wp:inline distB="114300" distT="114300" distL="114300" distR="114300">
             <wp:extent cx="5731200" cy="2501900"/>
             <wp:effectExtent b="0" l="0" r="0" t="0"/>
-            <wp:docPr id="27" name="image24.png"/>
+            <wp:docPr id="16" name="image11.png"/>
             <a:graphic>
               <a:graphicData uri="http://schemas.openxmlformats.org/drawingml/2006/picture">
                 <pic:pic>
                   <pic:nvPicPr>
-                    <pic:cNvPr id="0" name="image24.png"/>
+                    <pic:cNvPr id="0" name="image11.png"/>
                     <pic:cNvPicPr preferRelativeResize="0"/>
                   </pic:nvPicPr>
                   <pic:blipFill>
@@ -7649,12 +7685,12 @@
           <wp:inline distB="114300" distT="114300" distL="114300" distR="114300">
             <wp:extent cx="5731200" cy="4648200"/>
             <wp:effectExtent b="0" l="0" r="0" t="0"/>
-            <wp:docPr id="8" name="image2.png"/>
+            <wp:docPr id="4" name="image16.png"/>
             <a:graphic>
               <a:graphicData uri="http://schemas.openxmlformats.org/drawingml/2006/picture">
                 <pic:pic>
                   <pic:nvPicPr>
-                    <pic:cNvPr id="0" name="image2.png"/>
+                    <pic:cNvPr id="0" name="image16.png"/>
                     <pic:cNvPicPr preferRelativeResize="0"/>
                   </pic:nvPicPr>
                   <pic:blipFill>
@@ -7889,12 +7925,12 @@
           <wp:inline distB="114300" distT="114300" distL="114300" distR="114300">
             <wp:extent cx="5731200" cy="5118100"/>
             <wp:effectExtent b="0" l="0" r="0" t="0"/>
-            <wp:docPr id="16" name="image16.png"/>
+            <wp:docPr id="9" name="image14.png"/>
             <a:graphic>
               <a:graphicData uri="http://schemas.openxmlformats.org/drawingml/2006/picture">
                 <pic:pic>
                   <pic:nvPicPr>
-                    <pic:cNvPr id="0" name="image16.png"/>
+                    <pic:cNvPr id="0" name="image14.png"/>
                     <pic:cNvPicPr preferRelativeResize="0"/>
                   </pic:nvPicPr>
                   <pic:blipFill>
@@ -7930,12 +7966,12 @@
           <wp:inline distB="114300" distT="114300" distL="114300" distR="114300">
             <wp:extent cx="5731200" cy="5753100"/>
             <wp:effectExtent b="0" l="0" r="0" t="0"/>
-            <wp:docPr id="18" name="image28.png"/>
+            <wp:docPr id="10" name="image17.png"/>
             <a:graphic>
               <a:graphicData uri="http://schemas.openxmlformats.org/drawingml/2006/picture">
                 <pic:pic>
                   <pic:nvPicPr>
-                    <pic:cNvPr id="0" name="image28.png"/>
+                    <pic:cNvPr id="0" name="image17.png"/>
                     <pic:cNvPicPr preferRelativeResize="0"/>
                   </pic:nvPicPr>
                   <pic:blipFill>
@@ -8107,12 +8143,12 @@
           <wp:inline distB="114300" distT="114300" distL="114300" distR="114300">
             <wp:extent cx="5731200" cy="3860800"/>
             <wp:effectExtent b="0" l="0" r="0" t="0"/>
-            <wp:docPr id="2" name="image10.png"/>
+            <wp:docPr id="21" name="image20.png"/>
             <a:graphic>
               <a:graphicData uri="http://schemas.openxmlformats.org/drawingml/2006/picture">
                 <pic:pic>
                   <pic:nvPicPr>
-                    <pic:cNvPr id="0" name="image10.png"/>
+                    <pic:cNvPr id="0" name="image20.png"/>
                     <pic:cNvPicPr preferRelativeResize="0"/>
                   </pic:nvPicPr>
                   <pic:blipFill>
@@ -8335,12 +8371,12 @@
           <wp:inline distB="114300" distT="114300" distL="114300" distR="114300">
             <wp:extent cx="5731200" cy="2425700"/>
             <wp:effectExtent b="0" l="0" r="0" t="0"/>
-            <wp:docPr id="12" name="image5.png"/>
+            <wp:docPr id="25" name="image18.png"/>
             <a:graphic>
               <a:graphicData uri="http://schemas.openxmlformats.org/drawingml/2006/picture">
                 <pic:pic>
                   <pic:nvPicPr>
-                    <pic:cNvPr id="0" name="image5.png"/>
+                    <pic:cNvPr id="0" name="image18.png"/>
                     <pic:cNvPicPr preferRelativeResize="0"/>
                   </pic:nvPicPr>
                   <pic:blipFill>
@@ -8373,7 +8409,7 @@
     <w:p>
       <w:pPr>
         <w:spacing w:line="240" w:lineRule="auto"/>
-        <w:ind w:left="2880" w:firstLine="0"/>
+        <w:ind w:left="720" w:firstLine="720"/>
         <w:rPr>
           <w:rFonts w:ascii="Times New Roman" w:cs="Times New Roman" w:eastAsia="Times New Roman" w:hAnsi="Times New Roman"/>
           <w:i w:val="1"/>
@@ -8393,7 +8429,7 @@
           <w:szCs w:val="20"/>
           <w:rtl w:val="0"/>
         </w:rPr>
-        <w:t xml:space="preserve">Рис 16. Результат виконання задачі 0181</w:t>
+        <w:t xml:space="preserve">    Рис 16. Результат виконання задачі про зарядну станцію</w:t>
       </w:r>
     </w:p>
     <w:p>
@@ -8495,12 +8531,12 @@
           <wp:inline distB="114300" distT="114300" distL="114300" distR="114300">
             <wp:extent cx="5731200" cy="4229100"/>
             <wp:effectExtent b="0" l="0" r="0" t="0"/>
-            <wp:docPr id="24" name="image19.png"/>
+            <wp:docPr id="14" name="image1.png"/>
             <a:graphic>
               <a:graphicData uri="http://schemas.openxmlformats.org/drawingml/2006/picture">
                 <pic:pic>
                   <pic:nvPicPr>
-                    <pic:cNvPr id="0" name="image19.png"/>
+                    <pic:cNvPr id="0" name="image1.png"/>
                     <pic:cNvPicPr preferRelativeResize="0"/>
                   </pic:nvPicPr>
                   <pic:blipFill>
@@ -8532,6 +8568,60 @@
     </w:p>
     <w:p>
       <w:pPr>
+        <w:spacing w:after="200" w:line="276" w:lineRule="auto"/>
+        <w:rPr>
+          <w:rFonts w:ascii="Times New Roman" w:cs="Times New Roman" w:eastAsia="Times New Roman" w:hAnsi="Times New Roman"/>
+          <w:sz w:val="24"/>
+          <w:szCs w:val="24"/>
+        </w:rPr>
+      </w:pPr>
+      <w:r>
+        <w:rPr>
+          <w:rFonts w:ascii="Times New Roman" w:cs="Times New Roman" w:eastAsia="Times New Roman" w:hAnsi="Times New Roman"/>
+          <w:sz w:val="24"/>
+          <w:szCs w:val="24"/>
+        </w:rPr>
+        <w:drawing>
+          <wp:inline distB="114300" distT="114300" distL="114300" distR="114300">
+            <wp:extent cx="5731200" cy="304800"/>
+            <wp:effectExtent b="0" l="0" r="0" t="0"/>
+            <wp:docPr id="19" name="image13.png"/>
+            <a:graphic>
+              <a:graphicData uri="http://schemas.openxmlformats.org/drawingml/2006/picture">
+                <pic:pic>
+                  <pic:nvPicPr>
+                    <pic:cNvPr id="0" name="image13.png"/>
+                    <pic:cNvPicPr preferRelativeResize="0"/>
+                  </pic:nvPicPr>
+                  <pic:blipFill>
+                    <a:blip r:embed="rId41"/>
+                    <a:srcRect b="0" l="0" r="0" t="0"/>
+                    <a:stretch>
+                      <a:fillRect/>
+                    </a:stretch>
+                  </pic:blipFill>
+                  <pic:spPr>
+                    <a:xfrm>
+                      <a:off x="0" y="0"/>
+                      <a:ext cx="5731200" cy="304800"/>
+                    </a:xfrm>
+                    <a:prstGeom prst="rect"/>
+                    <a:ln/>
+                  </pic:spPr>
+                </pic:pic>
+              </a:graphicData>
+            </a:graphic>
+          </wp:inline>
+        </w:drawing>
+      </w:r>
+      <w:r>
+        <w:rPr>
+          <w:rtl w:val="0"/>
+        </w:rPr>
+      </w:r>
+    </w:p>
+    <w:p>
+      <w:pPr>
         <w:spacing w:line="240" w:lineRule="auto"/>
         <w:ind w:left="2880" w:firstLine="0"/>
         <w:rPr>
@@ -8654,16 +8744,16 @@
           <wp:inline distB="114300" distT="114300" distL="114300" distR="114300">
             <wp:extent cx="5731200" cy="4508500"/>
             <wp:effectExtent b="0" l="0" r="0" t="0"/>
-            <wp:docPr id="26" name="image23.png"/>
+            <wp:docPr id="30" name="image32.png"/>
             <a:graphic>
               <a:graphicData uri="http://schemas.openxmlformats.org/drawingml/2006/picture">
                 <pic:pic>
                   <pic:nvPicPr>
-                    <pic:cNvPr id="0" name="image23.png"/>
+                    <pic:cNvPr id="0" name="image32.png"/>
                     <pic:cNvPicPr preferRelativeResize="0"/>
                   </pic:nvPicPr>
                   <pic:blipFill>
-                    <a:blip r:embed="rId41"/>
+                    <a:blip r:embed="rId42"/>
                     <a:srcRect b="0" l="0" r="0" t="0"/>
                     <a:stretch>
                       <a:fillRect/>
@@ -8691,6 +8781,62 @@
     </w:p>
     <w:p>
       <w:pPr>
+        <w:spacing w:after="200" w:line="276" w:lineRule="auto"/>
+        <w:rPr>
+          <w:rFonts w:ascii="Times New Roman" w:cs="Times New Roman" w:eastAsia="Times New Roman" w:hAnsi="Times New Roman"/>
+          <w:sz w:val="24"/>
+          <w:szCs w:val="24"/>
+        </w:rPr>
+      </w:pPr>
+      <w:r>
+        <w:rPr>
+          <w:rFonts w:ascii="Times New Roman" w:cs="Times New Roman" w:eastAsia="Times New Roman" w:hAnsi="Times New Roman"/>
+          <w:b w:val="1"/>
+          <w:bCs w:val="1"/>
+          <w:sz w:val="24"/>
+          <w:szCs w:val="24"/>
+        </w:rPr>
+        <w:drawing>
+          <wp:inline distB="114300" distT="114300" distL="114300" distR="114300">
+            <wp:extent cx="5731200" cy="190500"/>
+            <wp:effectExtent b="0" l="0" r="0" t="0"/>
+            <wp:docPr id="32" name="image33.png"/>
+            <a:graphic>
+              <a:graphicData uri="http://schemas.openxmlformats.org/drawingml/2006/picture">
+                <pic:pic>
+                  <pic:nvPicPr>
+                    <pic:cNvPr id="0" name="image33.png"/>
+                    <pic:cNvPicPr preferRelativeResize="0"/>
+                  </pic:nvPicPr>
+                  <pic:blipFill>
+                    <a:blip r:embed="rId43"/>
+                    <a:srcRect b="0" l="0" r="0" t="0"/>
+                    <a:stretch>
+                      <a:fillRect/>
+                    </a:stretch>
+                  </pic:blipFill>
+                  <pic:spPr>
+                    <a:xfrm>
+                      <a:off x="0" y="0"/>
+                      <a:ext cx="5731200" cy="190500"/>
+                    </a:xfrm>
+                    <a:prstGeom prst="rect"/>
+                    <a:ln/>
+                  </pic:spPr>
+                </pic:pic>
+              </a:graphicData>
+            </a:graphic>
+          </wp:inline>
+        </w:drawing>
+      </w:r>
+      <w:r>
+        <w:rPr>
+          <w:rtl w:val="0"/>
+        </w:rPr>
+      </w:r>
+    </w:p>
+    <w:p>
+      <w:pPr>
         <w:spacing w:line="240" w:lineRule="auto"/>
         <w:ind w:left="2880" w:firstLine="0"/>
         <w:rPr>
@@ -8813,16 +8959,16 @@
           <wp:inline distB="114300" distT="114300" distL="114300" distR="114300">
             <wp:extent cx="5731200" cy="4279900"/>
             <wp:effectExtent b="0" l="0" r="0" t="0"/>
-            <wp:docPr id="7" name="image6.png"/>
+            <wp:docPr id="23" name="image23.png"/>
             <a:graphic>
               <a:graphicData uri="http://schemas.openxmlformats.org/drawingml/2006/picture">
                 <pic:pic>
                   <pic:nvPicPr>
-                    <pic:cNvPr id="0" name="image6.png"/>
+                    <pic:cNvPr id="0" name="image23.png"/>
                     <pic:cNvPicPr preferRelativeResize="0"/>
                   </pic:nvPicPr>
                   <pic:blipFill>
-                    <a:blip r:embed="rId42"/>
+                    <a:blip r:embed="rId44"/>
                     <a:srcRect b="0" l="0" r="0" t="0"/>
                     <a:stretch>
                       <a:fillRect/>
@@ -8850,6 +8996,62 @@
     </w:p>
     <w:p>
       <w:pPr>
+        <w:spacing w:after="200" w:line="276" w:lineRule="auto"/>
+        <w:rPr>
+          <w:rFonts w:ascii="Times New Roman" w:cs="Times New Roman" w:eastAsia="Times New Roman" w:hAnsi="Times New Roman"/>
+          <w:sz w:val="24"/>
+          <w:szCs w:val="24"/>
+        </w:rPr>
+      </w:pPr>
+      <w:r>
+        <w:rPr>
+          <w:rFonts w:ascii="Times New Roman" w:cs="Times New Roman" w:eastAsia="Times New Roman" w:hAnsi="Times New Roman"/>
+          <w:b w:val="1"/>
+          <w:bCs w:val="1"/>
+          <w:sz w:val="24"/>
+          <w:szCs w:val="24"/>
+        </w:rPr>
+        <w:drawing>
+          <wp:inline distB="114300" distT="114300" distL="114300" distR="114300">
+            <wp:extent cx="5731200" cy="254000"/>
+            <wp:effectExtent b="0" l="0" r="0" t="0"/>
+            <wp:docPr id="18" name="image5.png"/>
+            <a:graphic>
+              <a:graphicData uri="http://schemas.openxmlformats.org/drawingml/2006/picture">
+                <pic:pic>
+                  <pic:nvPicPr>
+                    <pic:cNvPr id="0" name="image5.png"/>
+                    <pic:cNvPicPr preferRelativeResize="0"/>
+                  </pic:nvPicPr>
+                  <pic:blipFill>
+                    <a:blip r:embed="rId45"/>
+                    <a:srcRect b="0" l="0" r="0" t="0"/>
+                    <a:stretch>
+                      <a:fillRect/>
+                    </a:stretch>
+                  </pic:blipFill>
+                  <pic:spPr>
+                    <a:xfrm>
+                      <a:off x="0" y="0"/>
+                      <a:ext cx="5731200" cy="254000"/>
+                    </a:xfrm>
+                    <a:prstGeom prst="rect"/>
+                    <a:ln/>
+                  </pic:spPr>
+                </pic:pic>
+              </a:graphicData>
+            </a:graphic>
+          </wp:inline>
+        </w:drawing>
+      </w:r>
+      <w:r>
+        <w:rPr>
+          <w:rtl w:val="0"/>
+        </w:rPr>
+      </w:r>
+    </w:p>
+    <w:p>
+      <w:pPr>
         <w:spacing w:line="240" w:lineRule="auto"/>
         <w:ind w:left="2880" w:firstLine="0"/>
         <w:rPr>
@@ -8871,7 +9073,7 @@
           <w:szCs w:val="20"/>
           <w:rtl w:val="0"/>
         </w:rPr>
-        <w:t xml:space="preserve">Рис 19. Результат виконання задачі 0023</w:t>
+        <w:t xml:space="preserve">Рис 19. Результат виконання задачі 0021</w:t>
       </w:r>
     </w:p>
     <w:p>
@@ -8895,25 +9097,6 @@
     </w:p>
     <w:p>
       <w:pPr>
-        <w:spacing w:line="240" w:lineRule="auto"/>
-        <w:ind w:left="2880" w:firstLine="0"/>
-        <w:rPr>
-          <w:rFonts w:ascii="Times New Roman" w:cs="Times New Roman" w:eastAsia="Times New Roman" w:hAnsi="Times New Roman"/>
-          <w:i w:val="1"/>
-          <w:iCs w:val="1"/>
-          <w:color w:val="3d85c6"/>
-          <w:sz w:val="20"/>
-          <w:szCs w:val="20"/>
-        </w:rPr>
-      </w:pPr>
-      <w:r>
-        <w:rPr>
-          <w:rtl w:val="0"/>
-        </w:rPr>
-      </w:r>
-    </w:p>
-    <w:p>
-      <w:pPr>
         <w:spacing w:after="200" w:line="276" w:lineRule="auto"/>
         <w:jc w:val="both"/>
         <w:rPr>
@@ -8972,16 +9155,16 @@
           <wp:inline distB="114300" distT="114300" distL="114300" distR="114300">
             <wp:extent cx="5731200" cy="4254500"/>
             <wp:effectExtent b="0" l="0" r="0" t="0"/>
-            <wp:docPr id="14" name="image15.png"/>
+            <wp:docPr id="8" name="image6.png"/>
             <a:graphic>
               <a:graphicData uri="http://schemas.openxmlformats.org/drawingml/2006/picture">
                 <pic:pic>
                   <pic:nvPicPr>
-                    <pic:cNvPr id="0" name="image15.png"/>
+                    <pic:cNvPr id="0" name="image6.png"/>
                     <pic:cNvPicPr preferRelativeResize="0"/>
                   </pic:nvPicPr>
                   <pic:blipFill>
-                    <a:blip r:embed="rId43"/>
+                    <a:blip r:embed="rId46"/>
                     <a:srcRect b="0" l="0" r="0" t="0"/>
                     <a:stretch>
                       <a:fillRect/>
@@ -9009,6 +9192,61 @@
     </w:p>
     <w:p>
       <w:pPr>
+        <w:spacing w:after="200" w:line="276" w:lineRule="auto"/>
+        <w:jc w:val="both"/>
+        <w:rPr>
+          <w:rFonts w:ascii="Times New Roman" w:cs="Times New Roman" w:eastAsia="Times New Roman" w:hAnsi="Times New Roman"/>
+          <w:sz w:val="24"/>
+          <w:szCs w:val="24"/>
+        </w:rPr>
+      </w:pPr>
+      <w:r>
+        <w:rPr>
+          <w:rFonts w:ascii="Times New Roman" w:cs="Times New Roman" w:eastAsia="Times New Roman" w:hAnsi="Times New Roman"/>
+          <w:sz w:val="24"/>
+          <w:szCs w:val="24"/>
+        </w:rPr>
+        <w:drawing>
+          <wp:inline distB="114300" distT="114300" distL="114300" distR="114300">
+            <wp:extent cx="5731200" cy="241300"/>
+            <wp:effectExtent b="0" l="0" r="0" t="0"/>
+            <wp:docPr id="31" name="image22.png"/>
+            <a:graphic>
+              <a:graphicData uri="http://schemas.openxmlformats.org/drawingml/2006/picture">
+                <pic:pic>
+                  <pic:nvPicPr>
+                    <pic:cNvPr id="0" name="image22.png"/>
+                    <pic:cNvPicPr preferRelativeResize="0"/>
+                  </pic:nvPicPr>
+                  <pic:blipFill>
+                    <a:blip r:embed="rId47"/>
+                    <a:srcRect b="0" l="0" r="0" t="0"/>
+                    <a:stretch>
+                      <a:fillRect/>
+                    </a:stretch>
+                  </pic:blipFill>
+                  <pic:spPr>
+                    <a:xfrm>
+                      <a:off x="0" y="0"/>
+                      <a:ext cx="5731200" cy="241300"/>
+                    </a:xfrm>
+                    <a:prstGeom prst="rect"/>
+                    <a:ln/>
+                  </pic:spPr>
+                </pic:pic>
+              </a:graphicData>
+            </a:graphic>
+          </wp:inline>
+        </w:drawing>
+      </w:r>
+      <w:r>
+        <w:rPr>
+          <w:rtl w:val="0"/>
+        </w:rPr>
+      </w:r>
+    </w:p>
+    <w:p>
+      <w:pPr>
         <w:spacing w:line="240" w:lineRule="auto"/>
         <w:ind w:left="2880" w:firstLine="0"/>
         <w:rPr>
@@ -9108,7 +9346,7 @@
           <w:szCs w:val="24"/>
           <w:rtl w:val="0"/>
         </w:rPr>
-        <w:t xml:space="preserve">Фактичний час, який витратив на виконання всіх завдань: 3 дні. </w:t>
+        <w:t xml:space="preserve">Фактичний час, який витратив на виконання всіх завдань: 6 годин. </w:t>
       </w:r>
       <w:r>
         <w:rPr>
@@ -9223,16 +9461,16 @@
           <wp:inline distB="114300" distT="114300" distL="114300" distR="114300">
             <wp:extent cx="5731200" cy="2222500"/>
             <wp:effectExtent b="0" l="0" r="0" t="0"/>
-            <wp:docPr id="20" name="image14.png"/>
+            <wp:docPr id="12" name="image9.png"/>
             <a:graphic>
               <a:graphicData uri="http://schemas.openxmlformats.org/drawingml/2006/picture">
                 <pic:pic>
                   <pic:nvPicPr>
-                    <pic:cNvPr id="0" name="image14.png"/>
+                    <pic:cNvPr id="0" name="image9.png"/>
                     <pic:cNvPicPr preferRelativeResize="0"/>
                   </pic:nvPicPr>
                   <pic:blipFill>
-                    <a:blip r:embed="rId44"/>
+                    <a:blip r:embed="rId48"/>
                     <a:srcRect b="0" l="0" r="0" t="0"/>
                     <a:stretch>
                       <a:fillRect/>
@@ -9305,16 +9543,16 @@
           <wp:inline distB="114300" distT="114300" distL="114300" distR="114300">
             <wp:extent cx="5731200" cy="2565400"/>
             <wp:effectExtent b="0" l="0" r="0" t="0"/>
-            <wp:docPr id="1" name="image29.png"/>
+            <wp:docPr id="20" name="image8.png"/>
             <a:graphic>
               <a:graphicData uri="http://schemas.openxmlformats.org/drawingml/2006/picture">
                 <pic:pic>
                   <pic:nvPicPr>
-                    <pic:cNvPr id="0" name="image29.png"/>
+                    <pic:cNvPr id="0" name="image8.png"/>
                     <pic:cNvPicPr preferRelativeResize="0"/>
                   </pic:nvPicPr>
                   <pic:blipFill>
-                    <a:blip r:embed="rId45"/>
+                    <a:blip r:embed="rId49"/>
                     <a:srcRect b="0" l="0" r="0" t="0"/>
                     <a:stretch>
                       <a:fillRect/>
@@ -9524,7 +9762,7 @@
       </w:r>
     </w:p>
     <w:sectPr>
-      <w:footerReference r:id="rId46" w:type="default"/>
+      <w:footerReference r:id="rId50" w:type="default"/>
       <w:type w:val="nextPage"/>
       <w:pgSz w:h="16834" w:w="11909" w:orient="portrait"/>
       <w:pgMar w:bottom="1440" w:top="1440" w:left="1440" w:right="1440" w:header="720" w:footer="720"/>

</xml_diff>